<commit_message>
Redesign all formats for C-level audience + add PPTX
- HTML: white background, clean borders, subtle left-accent colors,
  gray role pills, professional table layout
- DOCX: navy accent on white, minimal color, numbered task tables
  with alternating gray rows, business-appropriate typography
- PPTX (new): widescreen 16:9 deck with cover slide, TOC with
  colored step numbers, one slide per step with task/owner tables,
  gate slides for Release and Governance checkpoints

Content fixes:
- Step 3: "Assess strategic alignment" now co-owned by AI Champion
- Step 5: "Sprint cycles" now co-owned by AI Enablement Team

https://claude.ai/code/session_014sYowDSYncDohFg42MDKfr
</commit_message>
<xml_diff>
--- a/AI-Use-Case-to-GTM-Step-Guide.docx
+++ b/AI-Use-Case-to-GTM-Step-Guide.docx
@@ -2,6 +2,8 @@
 <file path=word/document.xml><?xml version="1.0" encoding="utf-8"?>
 <w:document xmlns:wpc="http://schemas.microsoft.com/office/word/2010/wordprocessingCanvas" xmlns:mo="http://schemas.microsoft.com/office/mac/office/2008/main" xmlns:mc="http://schemas.openxmlformats.org/markup-compatibility/2006" xmlns:mv="urn:schemas-microsoft-com:mac:vml" xmlns:o="urn:schemas-microsoft-com:office:office" xmlns:r="http://schemas.openxmlformats.org/officeDocument/2006/relationships" xmlns:m="http://schemas.openxmlformats.org/officeDocument/2006/math" xmlns:v="urn:schemas-microsoft-com:vml" xmlns:wp14="http://schemas.microsoft.com/office/word/2010/wordprocessingDrawing" xmlns:wp="http://schemas.openxmlformats.org/drawingml/2006/wordprocessingDrawing" xmlns:w10="urn:schemas-microsoft-com:office:word" xmlns:w="http://schemas.openxmlformats.org/wordprocessingml/2006/main" xmlns:w14="http://schemas.microsoft.com/office/word/2010/wordml" xmlns:wpg="http://schemas.microsoft.com/office/word/2010/wordprocessingGroup" xmlns:wpi="http://schemas.microsoft.com/office/word/2010/wordprocessingInk" xmlns:wne="http://schemas.microsoft.com/office/word/2006/wordml" xmlns:wps="http://schemas.microsoft.com/office/word/2010/wordprocessingShape" mc:Ignorable="w14 wp14">
   <w:body>
+    <w:p/>
+    <w:p/>
     <w:p/>
     <w:p/>
     <w:p/>
@@ -15,7 +17,7 @@
         <w:rPr>
           <w:rFonts w:ascii="Calibri" w:hAnsi="Calibri"/>
           <w:b/>
-          <w:color w:val="1F2937"/>
+          <w:color w:val="1A1A2E"/>
           <w:sz w:val="72"/>
         </w:rPr>
         <w:t>AI Use Case Intake</w:t>
@@ -29,74 +31,13 @@
         <w:rPr>
           <w:rFonts w:ascii="Calibri" w:hAnsi="Calibri"/>
           <w:b/>
-          <w:color w:val="2563EB"/>
+          <w:color w:val="2B477A"/>
           <w:sz w:val="72"/>
         </w:rPr>
         <w:t>to Go-To-Market</w:t>
       </w:r>
     </w:p>
     <w:p/>
-    <w:p>
-      <w:pPr>
-        <w:jc w:val="center"/>
-      </w:pPr>
-      <w:r>
-        <w:rPr>
-          <w:color w:val="2563EB"/>
-          <w:sz w:val="28"/>
-        </w:rPr>
-        <w:t xml:space="preserve">████ </w:t>
-      </w:r>
-      <w:r>
-        <w:rPr>
-          <w:color w:val="10B981"/>
-          <w:sz w:val="28"/>
-        </w:rPr>
-        <w:t xml:space="preserve">████ </w:t>
-      </w:r>
-      <w:r>
-        <w:rPr>
-          <w:color w:val="F59E0B"/>
-          <w:sz w:val="28"/>
-        </w:rPr>
-        <w:t xml:space="preserve">████ </w:t>
-      </w:r>
-      <w:r>
-        <w:rPr>
-          <w:color w:val="F43F5E"/>
-          <w:sz w:val="28"/>
-        </w:rPr>
-        <w:t xml:space="preserve">████ </w:t>
-      </w:r>
-      <w:r>
-        <w:rPr>
-          <w:color w:val="8B5CF6"/>
-          <w:sz w:val="28"/>
-        </w:rPr>
-        <w:t xml:space="preserve">████ </w:t>
-      </w:r>
-      <w:r>
-        <w:rPr>
-          <w:color w:val="06B6D4"/>
-          <w:sz w:val="28"/>
-        </w:rPr>
-        <w:t xml:space="preserve">████ </w:t>
-      </w:r>
-      <w:r>
-        <w:rPr>
-          <w:color w:val="F97316"/>
-          <w:sz w:val="28"/>
-        </w:rPr>
-        <w:t xml:space="preserve">████ </w:t>
-      </w:r>
-      <w:r>
-        <w:rPr>
-          <w:color w:val="14B8A6"/>
-          <w:sz w:val="28"/>
-        </w:rPr>
-        <w:t xml:space="preserve">████ </w:t>
-      </w:r>
-    </w:p>
     <w:p/>
     <w:p>
       <w:pPr>
@@ -106,7 +47,7 @@
         <w:rPr>
           <w:rFonts w:ascii="Calibri" w:hAnsi="Calibri"/>
           <w:color w:val="6B7280"/>
-          <w:sz w:val="36"/>
+          <w:sz w:val="32"/>
         </w:rPr>
         <w:t>Step-by-Step Guide</w:t>
       </w:r>
@@ -119,8 +60,8 @@
       <w:r>
         <w:rPr>
           <w:rFonts w:ascii="Calibri" w:hAnsi="Calibri"/>
-          <w:color w:val="9CA3AF"/>
-          <w:sz w:val="24"/>
+          <w:color w:val="6B7280"/>
+          <w:sz w:val="22"/>
         </w:rPr>
         <w:t>8 steps from ideation to launch</w:t>
         <w:br/>
@@ -131,6 +72,21 @@
     <w:p/>
     <w:p/>
     <w:p/>
+    <w:p/>
+    <w:p/>
+    <w:p>
+      <w:pPr>
+        <w:jc w:val="center"/>
+      </w:pPr>
+      <w:r>
+        <w:rPr>
+          <w:color w:val="D1D5DB"/>
+          <w:sz w:val="16"/>
+        </w:rPr>
+        <w:t>────────────────────────────────────────</w:t>
+      </w:r>
+    </w:p>
+    <w:p/>
     <w:p>
       <w:pPr>
         <w:jc w:val="center"/>
@@ -138,8 +94,8 @@
       <w:r>
         <w:rPr>
           <w:b/>
-          <w:color w:val="1F2937"/>
-          <w:sz w:val="28"/>
+          <w:color w:val="1A1A2E"/>
+          <w:sz w:val="26"/>
         </w:rPr>
         <w:t>AI Power Team</w:t>
       </w:r>
@@ -150,8 +106,8 @@
       </w:pPr>
       <w:r>
         <w:rPr>
-          <w:color w:val="9CA3AF"/>
-          <w:sz w:val="22"/>
+          <w:color w:val="6B7280"/>
+          <w:sz w:val="20"/>
         </w:rPr>
         <w:t>April 2026</w:t>
       </w:r>
@@ -166,9 +122,6 @@
         <w:pStyle w:val="Heading1"/>
       </w:pPr>
       <w:r>
-        <w:rPr>
-          <w:color w:val="1F2937"/>
-        </w:rPr>
         <w:t>Table of Contents</w:t>
       </w:r>
     </w:p>
@@ -181,15 +134,15 @@
         <w:rPr>
           <w:rFonts w:ascii="Calibri" w:hAnsi="Calibri"/>
           <w:b/>
-          <w:color w:val="2563EB"/>
-          <w:sz w:val="26"/>
+          <w:color w:val="2B477A"/>
+          <w:sz w:val="24"/>
         </w:rPr>
         <w:t xml:space="preserve">  1.  </w:t>
       </w:r>
       <w:r>
         <w:rPr>
           <w:rFonts w:ascii="Calibri" w:hAnsi="Calibri"/>
-          <w:color w:val="1F2937"/>
+          <w:color w:val="1A1A2E"/>
           <w:sz w:val="24"/>
         </w:rPr>
         <w:t>Identify &amp; Generate AI Use Cases</w:t>
@@ -197,7 +150,7 @@
       <w:r>
         <w:rPr>
           <w:rFonts w:ascii="Calibri" w:hAnsi="Calibri"/>
-          <w:color w:val="2563EB"/>
+          <w:color w:val="6B7280"/>
           <w:sz w:val="18"/>
         </w:rPr>
         <w:t xml:space="preserve">   Ideation</w:t>
@@ -211,15 +164,15 @@
         <w:rPr>
           <w:rFonts w:ascii="Calibri" w:hAnsi="Calibri"/>
           <w:b/>
-          <w:color w:val="10B981"/>
-          <w:sz w:val="26"/>
+          <w:color w:val="2B477A"/>
+          <w:sz w:val="24"/>
         </w:rPr>
         <w:t xml:space="preserve">  2.  </w:t>
       </w:r>
       <w:r>
         <w:rPr>
           <w:rFonts w:ascii="Calibri" w:hAnsi="Calibri"/>
-          <w:color w:val="1F2937"/>
+          <w:color w:val="1A1A2E"/>
           <w:sz w:val="24"/>
         </w:rPr>
         <w:t>Submit Use Case Intake</w:t>
@@ -227,7 +180,7 @@
       <w:r>
         <w:rPr>
           <w:rFonts w:ascii="Calibri" w:hAnsi="Calibri"/>
-          <w:color w:val="10B981"/>
+          <w:color w:val="6B7280"/>
           <w:sz w:val="18"/>
         </w:rPr>
         <w:t xml:space="preserve">   Intake</w:t>
@@ -241,15 +194,15 @@
         <w:rPr>
           <w:rFonts w:ascii="Calibri" w:hAnsi="Calibri"/>
           <w:b/>
-          <w:color w:val="F59E0B"/>
-          <w:sz w:val="26"/>
+          <w:color w:val="2B477A"/>
+          <w:sz w:val="24"/>
         </w:rPr>
         <w:t xml:space="preserve">  3.  </w:t>
       </w:r>
       <w:r>
         <w:rPr>
           <w:rFonts w:ascii="Calibri" w:hAnsi="Calibri"/>
-          <w:color w:val="1F2937"/>
+          <w:color w:val="1A1A2E"/>
           <w:sz w:val="24"/>
         </w:rPr>
         <w:t>AI Enablement Team Review</w:t>
@@ -257,7 +210,7 @@
       <w:r>
         <w:rPr>
           <w:rFonts w:ascii="Calibri" w:hAnsi="Calibri"/>
-          <w:color w:val="F59E0B"/>
+          <w:color w:val="6B7280"/>
           <w:sz w:val="18"/>
         </w:rPr>
         <w:t xml:space="preserve">   Assessment</w:t>
@@ -274,7 +227,7 @@
           <w:color w:val="6B7280"/>
           <w:sz w:val="20"/>
         </w:rPr>
-        <w:t xml:space="preserve">        ⚠  Release Gate Decision</w:t>
+        <w:t xml:space="preserve">        Release Gate Decision</w:t>
       </w:r>
     </w:p>
     <w:p>
@@ -285,15 +238,15 @@
         <w:rPr>
           <w:rFonts w:ascii="Calibri" w:hAnsi="Calibri"/>
           <w:b/>
-          <w:color w:val="F43F5E"/>
-          <w:sz w:val="26"/>
+          <w:color w:val="2B477A"/>
+          <w:sz w:val="24"/>
         </w:rPr>
         <w:t xml:space="preserve">  4.  </w:t>
       </w:r>
       <w:r>
         <w:rPr>
           <w:rFonts w:ascii="Calibri" w:hAnsi="Calibri"/>
-          <w:color w:val="1F2937"/>
+          <w:color w:val="1A1A2E"/>
           <w:sz w:val="24"/>
         </w:rPr>
         <w:t>Project Setup &amp; Resource Allocation</w:t>
@@ -301,7 +254,7 @@
       <w:r>
         <w:rPr>
           <w:rFonts w:ascii="Calibri" w:hAnsi="Calibri"/>
-          <w:color w:val="F43F5E"/>
+          <w:color w:val="6B7280"/>
           <w:sz w:val="18"/>
         </w:rPr>
         <w:t xml:space="preserve">   Setup</w:t>
@@ -315,15 +268,15 @@
         <w:rPr>
           <w:rFonts w:ascii="Calibri" w:hAnsi="Calibri"/>
           <w:b/>
-          <w:color w:val="8B5CF6"/>
-          <w:sz w:val="26"/>
+          <w:color w:val="2B477A"/>
+          <w:sz w:val="24"/>
         </w:rPr>
         <w:t xml:space="preserve">  5.  </w:t>
       </w:r>
       <w:r>
         <w:rPr>
           <w:rFonts w:ascii="Calibri" w:hAnsi="Calibri"/>
-          <w:color w:val="1F2937"/>
+          <w:color w:val="1A1A2E"/>
           <w:sz w:val="24"/>
         </w:rPr>
         <w:t>Define the MVP &amp; Build</w:t>
@@ -331,7 +284,7 @@
       <w:r>
         <w:rPr>
           <w:rFonts w:ascii="Calibri" w:hAnsi="Calibri"/>
-          <w:color w:val="8B5CF6"/>
+          <w:color w:val="6B7280"/>
           <w:sz w:val="18"/>
         </w:rPr>
         <w:t xml:space="preserve">   Build</w:t>
@@ -348,7 +301,7 @@
           <w:color w:val="6B7280"/>
           <w:sz w:val="20"/>
         </w:rPr>
-        <w:t xml:space="preserve">        ⚠  Governance Gate</w:t>
+        <w:t xml:space="preserve">        Governance Gate</w:t>
       </w:r>
     </w:p>
     <w:p>
@@ -359,15 +312,15 @@
         <w:rPr>
           <w:rFonts w:ascii="Calibri" w:hAnsi="Calibri"/>
           <w:b/>
-          <w:color w:val="06B6D4"/>
-          <w:sz w:val="26"/>
+          <w:color w:val="2B477A"/>
+          <w:sz w:val="24"/>
         </w:rPr>
         <w:t xml:space="preserve">  6.  </w:t>
       </w:r>
       <w:r>
         <w:rPr>
           <w:rFonts w:ascii="Calibri" w:hAnsi="Calibri"/>
-          <w:color w:val="1F2937"/>
+          <w:color w:val="1A1A2E"/>
           <w:sz w:val="24"/>
         </w:rPr>
         <w:t>GTM Ready: Package the Solution</w:t>
@@ -375,7 +328,7 @@
       <w:r>
         <w:rPr>
           <w:rFonts w:ascii="Calibri" w:hAnsi="Calibri"/>
-          <w:color w:val="06B6D4"/>
+          <w:color w:val="6B7280"/>
           <w:sz w:val="18"/>
         </w:rPr>
         <w:t xml:space="preserve">   GTM Ready</w:t>
@@ -389,15 +342,15 @@
         <w:rPr>
           <w:rFonts w:ascii="Calibri" w:hAnsi="Calibri"/>
           <w:b/>
-          <w:color w:val="F97316"/>
-          <w:sz w:val="26"/>
+          <w:color w:val="2B477A"/>
+          <w:sz w:val="24"/>
         </w:rPr>
         <w:t xml:space="preserve">  7.  </w:t>
       </w:r>
       <w:r>
         <w:rPr>
           <w:rFonts w:ascii="Calibri" w:hAnsi="Calibri"/>
-          <w:color w:val="1F2937"/>
+          <w:color w:val="1A1A2E"/>
           <w:sz w:val="24"/>
         </w:rPr>
         <w:t>GTM Push: Showcase &amp; Sales Activation</w:t>
@@ -405,7 +358,7 @@
       <w:r>
         <w:rPr>
           <w:rFonts w:ascii="Calibri" w:hAnsi="Calibri"/>
-          <w:color w:val="F97316"/>
+          <w:color w:val="6B7280"/>
           <w:sz w:val="18"/>
         </w:rPr>
         <w:t xml:space="preserve">   Go-To-Market</w:t>
@@ -419,15 +372,15 @@
         <w:rPr>
           <w:rFonts w:ascii="Calibri" w:hAnsi="Calibri"/>
           <w:b/>
-          <w:color w:val="14B8A6"/>
-          <w:sz w:val="26"/>
+          <w:color w:val="2B477A"/>
+          <w:sz w:val="24"/>
         </w:rPr>
         <w:t xml:space="preserve">  8.  </w:t>
       </w:r>
       <w:r>
         <w:rPr>
           <w:rFonts w:ascii="Calibri" w:hAnsi="Calibri"/>
-          <w:color w:val="1F2937"/>
+          <w:color w:val="1A1A2E"/>
           <w:sz w:val="24"/>
         </w:rPr>
         <w:t>Track Results &amp; Continuous Improvement</w:t>
@@ -435,7 +388,7 @@
       <w:r>
         <w:rPr>
           <w:rFonts w:ascii="Calibri" w:hAnsi="Calibri"/>
-          <w:color w:val="14B8A6"/>
+          <w:color w:val="6B7280"/>
           <w:sz w:val="18"/>
         </w:rPr>
         <w:t xml:space="preserve">   Measure</w:t>
@@ -451,9 +404,6 @@
         <w:pStyle w:val="Heading1"/>
       </w:pPr>
       <w:r>
-        <w:rPr>
-          <w:color w:val="2563EB"/>
-        </w:rPr>
         <w:t>Step 1: Identify &amp; Generate AI Use Cases</w:t>
       </w:r>
     </w:p>
@@ -462,10 +412,10 @@
         <w:rPr>
           <w:rFonts w:ascii="Calibri" w:hAnsi="Calibri"/>
           <w:b/>
-          <w:color w:val="2563EB"/>
+          <w:color w:val="6B7280"/>
           <w:sz w:val="18"/>
         </w:rPr>
-        <w:t>●  IDEATION</w:t>
+        <w:t>IDEATION</w:t>
       </w:r>
     </w:p>
     <w:p>
@@ -474,10 +424,10 @@
       </w:pPr>
       <w:r>
         <w:rPr>
-          <w:color w:val="2563EB"/>
-          <w:sz w:val="12"/>
+          <w:color w:val="D1D5DB"/>
+          <w:sz w:val="10"/>
         </w:rPr>
-        <w:t>─────────────────────────────────────────────────────────────────</w:t>
+        <w:t>────────────────────────────────────────────────────────────────────────</w:t>
       </w:r>
     </w:p>
     <w:tbl>
@@ -488,14 +438,35 @@
         <w:tblLook w:firstColumn="1" w:firstRow="1" w:lastColumn="0" w:lastRow="0" w:noHBand="0" w:noVBand="1" w:val="04A0"/>
       </w:tblPr>
       <w:tblGrid>
-        <w:gridCol w:w="4873"/>
-        <w:gridCol w:w="4873"/>
+        <w:gridCol w:w="3135"/>
+        <w:gridCol w:w="3135"/>
+        <w:gridCol w:w="3135"/>
       </w:tblGrid>
       <w:tr>
         <w:tc>
           <w:tcPr>
-            <w:tcW w:type="dxa" w:w="6803"/>
-            <w:shd w:fill="2563EB"/>
+            <w:tcW w:type="dxa" w:w="567"/>
+            <w:shd w:fill="2B477A"/>
+          </w:tcPr>
+          <w:p>
+            <w:pPr>
+              <w:jc w:val="center"/>
+            </w:pPr>
+            <w:r>
+              <w:rPr>
+                <w:rFonts w:ascii="Calibri" w:hAnsi="Calibri"/>
+                <w:b/>
+                <w:color w:val="FFFFFF"/>
+                <w:sz w:val="18"/>
+              </w:rPr>
+              <w:t>#</w:t>
+            </w:r>
+          </w:p>
+        </w:tc>
+        <w:tc>
+          <w:tcPr>
+            <w:tcW w:type="dxa" w:w="5669"/>
+            <w:shd w:fill="2B477A"/>
           </w:tcPr>
           <w:p>
             <w:pPr>
@@ -514,12 +485,12 @@
         </w:tc>
         <w:tc>
           <w:tcPr>
-            <w:tcW w:type="dxa" w:w="2551"/>
-            <w:shd w:fill="2563EB"/>
+            <w:tcW w:type="dxa" w:w="2835"/>
+            <w:shd w:fill="2B477A"/>
           </w:tcPr>
           <w:p>
             <w:pPr>
-              <w:jc w:val="right"/>
+              <w:jc w:val="left"/>
             </w:pPr>
             <w:r>
               <w:rPr>
@@ -536,8 +507,27 @@
       <w:tr>
         <w:tc>
           <w:tcPr>
-            <w:tcW w:type="dxa" w:w="6803"/>
-            <w:shd w:fill="D6E4FF"/>
+            <w:tcW w:type="dxa" w:w="567"/>
+            <w:shd w:fill="F3F4F6"/>
+          </w:tcPr>
+          <w:p>
+            <w:pPr>
+              <w:jc w:val="center"/>
+            </w:pPr>
+            <w:r>
+              <w:rPr>
+                <w:rFonts w:ascii="Calibri" w:hAnsi="Calibri"/>
+                <w:color w:val="6B7280"/>
+                <w:sz w:val="18"/>
+              </w:rPr>
+              <w:t>1.1</w:t>
+            </w:r>
+          </w:p>
+        </w:tc>
+        <w:tc>
+          <w:tcPr>
+            <w:tcW w:type="dxa" w:w="5669"/>
+            <w:shd w:fill="F3F4F6"/>
           </w:tcPr>
           <w:p>
             <w:r>
@@ -565,18 +555,15 @@
         </w:tc>
         <w:tc>
           <w:tcPr>
-            <w:tcW w:type="dxa" w:w="2551"/>
-            <w:shd w:fill="D6E4FF"/>
+            <w:tcW w:type="dxa" w:w="2835"/>
+            <w:shd w:fill="F3F4F6"/>
           </w:tcPr>
           <w:p>
-            <w:pPr>
-              <w:jc w:val="right"/>
-            </w:pPr>
             <w:r>
               <w:rPr>
                 <w:rFonts w:ascii="Calibri" w:hAnsi="Calibri"/>
                 <w:b/>
-                <w:color w:val="2563EB"/>
+                <w:color w:val="2B477A"/>
                 <w:sz w:val="18"/>
               </w:rPr>
               <w:t>Practice Lead</w:t>
@@ -587,7 +574,25 @@
       <w:tr>
         <w:tc>
           <w:tcPr>
-            <w:tcW w:type="dxa" w:w="6803"/>
+            <w:tcW w:type="dxa" w:w="567"/>
+          </w:tcPr>
+          <w:p>
+            <w:pPr>
+              <w:jc w:val="center"/>
+            </w:pPr>
+            <w:r>
+              <w:rPr>
+                <w:rFonts w:ascii="Calibri" w:hAnsi="Calibri"/>
+                <w:color w:val="6B7280"/>
+                <w:sz w:val="18"/>
+              </w:rPr>
+              <w:t>1.2</w:t>
+            </w:r>
+          </w:p>
+        </w:tc>
+        <w:tc>
+          <w:tcPr>
+            <w:tcW w:type="dxa" w:w="5669"/>
           </w:tcPr>
           <w:p>
             <w:r>
@@ -601,17 +606,14 @@
         </w:tc>
         <w:tc>
           <w:tcPr>
-            <w:tcW w:type="dxa" w:w="2551"/>
+            <w:tcW w:type="dxa" w:w="2835"/>
           </w:tcPr>
           <w:p>
-            <w:pPr>
-              <w:jc w:val="right"/>
-            </w:pPr>
             <w:r>
               <w:rPr>
                 <w:rFonts w:ascii="Calibri" w:hAnsi="Calibri"/>
                 <w:b/>
-                <w:color w:val="2563EB"/>
+                <w:color w:val="2B477A"/>
                 <w:sz w:val="18"/>
               </w:rPr>
               <w:t>AI Champion</w:t>
@@ -622,8 +624,27 @@
       <w:tr>
         <w:tc>
           <w:tcPr>
-            <w:tcW w:type="dxa" w:w="6803"/>
-            <w:shd w:fill="D6E4FF"/>
+            <w:tcW w:type="dxa" w:w="567"/>
+            <w:shd w:fill="F3F4F6"/>
+          </w:tcPr>
+          <w:p>
+            <w:pPr>
+              <w:jc w:val="center"/>
+            </w:pPr>
+            <w:r>
+              <w:rPr>
+                <w:rFonts w:ascii="Calibri" w:hAnsi="Calibri"/>
+                <w:color w:val="6B7280"/>
+                <w:sz w:val="18"/>
+              </w:rPr>
+              <w:t>1.3</w:t>
+            </w:r>
+          </w:p>
+        </w:tc>
+        <w:tc>
+          <w:tcPr>
+            <w:tcW w:type="dxa" w:w="5669"/>
+            <w:shd w:fill="F3F4F6"/>
           </w:tcPr>
           <w:p>
             <w:r>
@@ -666,18 +687,15 @@
         </w:tc>
         <w:tc>
           <w:tcPr>
-            <w:tcW w:type="dxa" w:w="2551"/>
-            <w:shd w:fill="D6E4FF"/>
+            <w:tcW w:type="dxa" w:w="2835"/>
+            <w:shd w:fill="F3F4F6"/>
           </w:tcPr>
           <w:p>
-            <w:pPr>
-              <w:jc w:val="right"/>
-            </w:pPr>
             <w:r>
               <w:rPr>
                 <w:rFonts w:ascii="Calibri" w:hAnsi="Calibri"/>
                 <w:b/>
-                <w:color w:val="2563EB"/>
+                <w:color w:val="2B477A"/>
                 <w:sz w:val="18"/>
               </w:rPr>
               <w:t>AI Champion</w:t>
@@ -697,9 +715,6 @@
         <w:pStyle w:val="Heading1"/>
       </w:pPr>
       <w:r>
-        <w:rPr>
-          <w:color w:val="10B981"/>
-        </w:rPr>
         <w:t>Step 2: Submit Use Case Intake</w:t>
       </w:r>
     </w:p>
@@ -708,10 +723,10 @@
         <w:rPr>
           <w:rFonts w:ascii="Calibri" w:hAnsi="Calibri"/>
           <w:b/>
-          <w:color w:val="10B981"/>
+          <w:color w:val="6B7280"/>
           <w:sz w:val="18"/>
         </w:rPr>
-        <w:t>●  INTAKE</w:t>
+        <w:t>INTAKE</w:t>
       </w:r>
     </w:p>
     <w:p>
@@ -720,10 +735,10 @@
       </w:pPr>
       <w:r>
         <w:rPr>
-          <w:color w:val="10B981"/>
-          <w:sz w:val="12"/>
+          <w:color w:val="D1D5DB"/>
+          <w:sz w:val="10"/>
         </w:rPr>
-        <w:t>─────────────────────────────────────────────────────────────────</w:t>
+        <w:t>────────────────────────────────────────────────────────────────────────</w:t>
       </w:r>
     </w:p>
     <w:tbl>
@@ -734,14 +749,35 @@
         <w:tblLook w:firstColumn="1" w:firstRow="1" w:lastColumn="0" w:lastRow="0" w:noHBand="0" w:noVBand="1" w:val="04A0"/>
       </w:tblPr>
       <w:tblGrid>
-        <w:gridCol w:w="4873"/>
-        <w:gridCol w:w="4873"/>
+        <w:gridCol w:w="3135"/>
+        <w:gridCol w:w="3135"/>
+        <w:gridCol w:w="3135"/>
       </w:tblGrid>
       <w:tr>
         <w:tc>
           <w:tcPr>
-            <w:tcW w:type="dxa" w:w="6803"/>
-            <w:shd w:fill="10B981"/>
+            <w:tcW w:type="dxa" w:w="567"/>
+            <w:shd w:fill="2B477A"/>
+          </w:tcPr>
+          <w:p>
+            <w:pPr>
+              <w:jc w:val="center"/>
+            </w:pPr>
+            <w:r>
+              <w:rPr>
+                <w:rFonts w:ascii="Calibri" w:hAnsi="Calibri"/>
+                <w:b/>
+                <w:color w:val="FFFFFF"/>
+                <w:sz w:val="18"/>
+              </w:rPr>
+              <w:t>#</w:t>
+            </w:r>
+          </w:p>
+        </w:tc>
+        <w:tc>
+          <w:tcPr>
+            <w:tcW w:type="dxa" w:w="5669"/>
+            <w:shd w:fill="2B477A"/>
           </w:tcPr>
           <w:p>
             <w:pPr>
@@ -760,12 +796,12 @@
         </w:tc>
         <w:tc>
           <w:tcPr>
-            <w:tcW w:type="dxa" w:w="2551"/>
-            <w:shd w:fill="10B981"/>
+            <w:tcW w:type="dxa" w:w="2835"/>
+            <w:shd w:fill="2B477A"/>
           </w:tcPr>
           <w:p>
             <w:pPr>
-              <w:jc w:val="right"/>
+              <w:jc w:val="left"/>
             </w:pPr>
             <w:r>
               <w:rPr>
@@ -782,8 +818,27 @@
       <w:tr>
         <w:tc>
           <w:tcPr>
-            <w:tcW w:type="dxa" w:w="6803"/>
-            <w:shd w:fill="D1FAE5"/>
+            <w:tcW w:type="dxa" w:w="567"/>
+            <w:shd w:fill="F3F4F6"/>
+          </w:tcPr>
+          <w:p>
+            <w:pPr>
+              <w:jc w:val="center"/>
+            </w:pPr>
+            <w:r>
+              <w:rPr>
+                <w:rFonts w:ascii="Calibri" w:hAnsi="Calibri"/>
+                <w:color w:val="6B7280"/>
+                <w:sz w:val="18"/>
+              </w:rPr>
+              <w:t>2.1</w:t>
+            </w:r>
+          </w:p>
+        </w:tc>
+        <w:tc>
+          <w:tcPr>
+            <w:tcW w:type="dxa" w:w="5669"/>
+            <w:shd w:fill="F3F4F6"/>
           </w:tcPr>
           <w:p>
             <w:r>
@@ -812,18 +867,15 @@
         </w:tc>
         <w:tc>
           <w:tcPr>
-            <w:tcW w:type="dxa" w:w="2551"/>
-            <w:shd w:fill="D1FAE5"/>
+            <w:tcW w:type="dxa" w:w="2835"/>
+            <w:shd w:fill="F3F4F6"/>
           </w:tcPr>
           <w:p>
-            <w:pPr>
-              <w:jc w:val="right"/>
-            </w:pPr>
             <w:r>
               <w:rPr>
                 <w:rFonts w:ascii="Calibri" w:hAnsi="Calibri"/>
                 <w:b/>
-                <w:color w:val="10B981"/>
+                <w:color w:val="2B477A"/>
                 <w:sz w:val="18"/>
               </w:rPr>
               <w:t>AI Champion</w:t>
@@ -834,7 +886,25 @@
       <w:tr>
         <w:tc>
           <w:tcPr>
-            <w:tcW w:type="dxa" w:w="6803"/>
+            <w:tcW w:type="dxa" w:w="567"/>
+          </w:tcPr>
+          <w:p>
+            <w:pPr>
+              <w:jc w:val="center"/>
+            </w:pPr>
+            <w:r>
+              <w:rPr>
+                <w:rFonts w:ascii="Calibri" w:hAnsi="Calibri"/>
+                <w:color w:val="6B7280"/>
+                <w:sz w:val="18"/>
+              </w:rPr>
+              <w:t>2.2</w:t>
+            </w:r>
+          </w:p>
+        </w:tc>
+        <w:tc>
+          <w:tcPr>
+            <w:tcW w:type="dxa" w:w="5669"/>
           </w:tcPr>
           <w:p>
             <w:r>
@@ -862,17 +932,14 @@
         </w:tc>
         <w:tc>
           <w:tcPr>
-            <w:tcW w:type="dxa" w:w="2551"/>
+            <w:tcW w:type="dxa" w:w="2835"/>
           </w:tcPr>
           <w:p>
-            <w:pPr>
-              <w:jc w:val="right"/>
-            </w:pPr>
             <w:r>
               <w:rPr>
                 <w:rFonts w:ascii="Calibri" w:hAnsi="Calibri"/>
                 <w:b/>
-                <w:color w:val="10B981"/>
+                <w:color w:val="2B477A"/>
                 <w:sz w:val="18"/>
               </w:rPr>
               <w:t>AI Champion</w:t>
@@ -883,8 +950,27 @@
       <w:tr>
         <w:tc>
           <w:tcPr>
-            <w:tcW w:type="dxa" w:w="6803"/>
-            <w:shd w:fill="D1FAE5"/>
+            <w:tcW w:type="dxa" w:w="567"/>
+            <w:shd w:fill="F3F4F6"/>
+          </w:tcPr>
+          <w:p>
+            <w:pPr>
+              <w:jc w:val="center"/>
+            </w:pPr>
+            <w:r>
+              <w:rPr>
+                <w:rFonts w:ascii="Calibri" w:hAnsi="Calibri"/>
+                <w:color w:val="6B7280"/>
+                <w:sz w:val="18"/>
+              </w:rPr>
+              <w:t>2.3</w:t>
+            </w:r>
+          </w:p>
+        </w:tc>
+        <w:tc>
+          <w:tcPr>
+            <w:tcW w:type="dxa" w:w="5669"/>
+            <w:shd w:fill="F3F4F6"/>
           </w:tcPr>
           <w:p>
             <w:r>
@@ -913,18 +999,15 @@
         </w:tc>
         <w:tc>
           <w:tcPr>
-            <w:tcW w:type="dxa" w:w="2551"/>
-            <w:shd w:fill="D1FAE5"/>
+            <w:tcW w:type="dxa" w:w="2835"/>
+            <w:shd w:fill="F3F4F6"/>
           </w:tcPr>
           <w:p>
-            <w:pPr>
-              <w:jc w:val="right"/>
-            </w:pPr>
             <w:r>
               <w:rPr>
                 <w:rFonts w:ascii="Calibri" w:hAnsi="Calibri"/>
                 <w:b/>
-                <w:color w:val="10B981"/>
+                <w:color w:val="2B477A"/>
                 <w:sz w:val="18"/>
               </w:rPr>
               <w:t>AI Champion</w:t>
@@ -935,7 +1018,25 @@
       <w:tr>
         <w:tc>
           <w:tcPr>
-            <w:tcW w:type="dxa" w:w="6803"/>
+            <w:tcW w:type="dxa" w:w="567"/>
+          </w:tcPr>
+          <w:p>
+            <w:pPr>
+              <w:jc w:val="center"/>
+            </w:pPr>
+            <w:r>
+              <w:rPr>
+                <w:rFonts w:ascii="Calibri" w:hAnsi="Calibri"/>
+                <w:color w:val="6B7280"/>
+                <w:sz w:val="18"/>
+              </w:rPr>
+              <w:t>2.4</w:t>
+            </w:r>
+          </w:p>
+        </w:tc>
+        <w:tc>
+          <w:tcPr>
+            <w:tcW w:type="dxa" w:w="5669"/>
           </w:tcPr>
           <w:p>
             <w:r>
@@ -964,17 +1065,14 @@
         </w:tc>
         <w:tc>
           <w:tcPr>
-            <w:tcW w:type="dxa" w:w="2551"/>
+            <w:tcW w:type="dxa" w:w="2835"/>
           </w:tcPr>
           <w:p>
-            <w:pPr>
-              <w:jc w:val="right"/>
-            </w:pPr>
             <w:r>
               <w:rPr>
                 <w:rFonts w:ascii="Calibri" w:hAnsi="Calibri"/>
                 <w:b/>
-                <w:color w:val="10B981"/>
+                <w:color w:val="2B477A"/>
                 <w:sz w:val="18"/>
               </w:rPr>
               <w:t>AI Champion</w:t>
@@ -985,8 +1083,27 @@
       <w:tr>
         <w:tc>
           <w:tcPr>
-            <w:tcW w:type="dxa" w:w="6803"/>
-            <w:shd w:fill="D1FAE5"/>
+            <w:tcW w:type="dxa" w:w="567"/>
+            <w:shd w:fill="F3F4F6"/>
+          </w:tcPr>
+          <w:p>
+            <w:pPr>
+              <w:jc w:val="center"/>
+            </w:pPr>
+            <w:r>
+              <w:rPr>
+                <w:rFonts w:ascii="Calibri" w:hAnsi="Calibri"/>
+                <w:color w:val="6B7280"/>
+                <w:sz w:val="18"/>
+              </w:rPr>
+              <w:t>2.5</w:t>
+            </w:r>
+          </w:p>
+        </w:tc>
+        <w:tc>
+          <w:tcPr>
+            <w:tcW w:type="dxa" w:w="5669"/>
+            <w:shd w:fill="F3F4F6"/>
           </w:tcPr>
           <w:p>
             <w:r>
@@ -1015,18 +1132,15 @@
         </w:tc>
         <w:tc>
           <w:tcPr>
-            <w:tcW w:type="dxa" w:w="2551"/>
-            <w:shd w:fill="D1FAE5"/>
+            <w:tcW w:type="dxa" w:w="2835"/>
+            <w:shd w:fill="F3F4F6"/>
           </w:tcPr>
           <w:p>
-            <w:pPr>
-              <w:jc w:val="right"/>
-            </w:pPr>
             <w:r>
               <w:rPr>
                 <w:rFonts w:ascii="Calibri" w:hAnsi="Calibri"/>
                 <w:b/>
-                <w:color w:val="10B981"/>
+                <w:color w:val="2B477A"/>
                 <w:sz w:val="18"/>
               </w:rPr>
               <w:t>AI Champion</w:t>
@@ -1037,7 +1151,25 @@
       <w:tr>
         <w:tc>
           <w:tcPr>
-            <w:tcW w:type="dxa" w:w="6803"/>
+            <w:tcW w:type="dxa" w:w="567"/>
+          </w:tcPr>
+          <w:p>
+            <w:pPr>
+              <w:jc w:val="center"/>
+            </w:pPr>
+            <w:r>
+              <w:rPr>
+                <w:rFonts w:ascii="Calibri" w:hAnsi="Calibri"/>
+                <w:color w:val="6B7280"/>
+                <w:sz w:val="18"/>
+              </w:rPr>
+              <w:t>2.6</w:t>
+            </w:r>
+          </w:p>
+        </w:tc>
+        <w:tc>
+          <w:tcPr>
+            <w:tcW w:type="dxa" w:w="5669"/>
           </w:tcPr>
           <w:p>
             <w:r>
@@ -1051,17 +1183,14 @@
         </w:tc>
         <w:tc>
           <w:tcPr>
-            <w:tcW w:type="dxa" w:w="2551"/>
+            <w:tcW w:type="dxa" w:w="2835"/>
           </w:tcPr>
           <w:p>
-            <w:pPr>
-              <w:jc w:val="right"/>
-            </w:pPr>
             <w:r>
               <w:rPr>
                 <w:rFonts w:ascii="Calibri" w:hAnsi="Calibri"/>
                 <w:b/>
-                <w:color w:val="10B981"/>
+                <w:color w:val="2B477A"/>
                 <w:sz w:val="18"/>
               </w:rPr>
               <w:t>AI Champion</w:t>
@@ -1072,8 +1201,27 @@
       <w:tr>
         <w:tc>
           <w:tcPr>
-            <w:tcW w:type="dxa" w:w="6803"/>
-            <w:shd w:fill="D1FAE5"/>
+            <w:tcW w:type="dxa" w:w="567"/>
+            <w:shd w:fill="F3F4F6"/>
+          </w:tcPr>
+          <w:p>
+            <w:pPr>
+              <w:jc w:val="center"/>
+            </w:pPr>
+            <w:r>
+              <w:rPr>
+                <w:rFonts w:ascii="Calibri" w:hAnsi="Calibri"/>
+                <w:color w:val="6B7280"/>
+                <w:sz w:val="18"/>
+              </w:rPr>
+              <w:t>2.7</w:t>
+            </w:r>
+          </w:p>
+        </w:tc>
+        <w:tc>
+          <w:tcPr>
+            <w:tcW w:type="dxa" w:w="5669"/>
+            <w:shd w:fill="F3F4F6"/>
           </w:tcPr>
           <w:p>
             <w:r>
@@ -1131,18 +1279,15 @@
         </w:tc>
         <w:tc>
           <w:tcPr>
-            <w:tcW w:type="dxa" w:w="2551"/>
-            <w:shd w:fill="D1FAE5"/>
+            <w:tcW w:type="dxa" w:w="2835"/>
+            <w:shd w:fill="F3F4F6"/>
           </w:tcPr>
           <w:p>
-            <w:pPr>
-              <w:jc w:val="right"/>
-            </w:pPr>
             <w:r>
               <w:rPr>
                 <w:rFonts w:ascii="Calibri" w:hAnsi="Calibri"/>
                 <w:b/>
-                <w:color w:val="10B981"/>
+                <w:color w:val="2B477A"/>
                 <w:sz w:val="18"/>
               </w:rPr>
               <w:t>AI Champion + Practice Lead</w:t>
@@ -1162,9 +1307,6 @@
         <w:pStyle w:val="Heading1"/>
       </w:pPr>
       <w:r>
-        <w:rPr>
-          <w:color w:val="F59E0B"/>
-        </w:rPr>
         <w:t>Step 3: AI Enablement Team Review</w:t>
       </w:r>
     </w:p>
@@ -1173,10 +1315,10 @@
         <w:rPr>
           <w:rFonts w:ascii="Calibri" w:hAnsi="Calibri"/>
           <w:b/>
-          <w:color w:val="F59E0B"/>
+          <w:color w:val="6B7280"/>
           <w:sz w:val="18"/>
         </w:rPr>
-        <w:t>●  ASSESSMENT</w:t>
+        <w:t>ASSESSMENT</w:t>
       </w:r>
     </w:p>
     <w:p>
@@ -1185,10 +1327,10 @@
       </w:pPr>
       <w:r>
         <w:rPr>
-          <w:color w:val="F59E0B"/>
-          <w:sz w:val="12"/>
+          <w:color w:val="D1D5DB"/>
+          <w:sz w:val="10"/>
         </w:rPr>
-        <w:t>─────────────────────────────────────────────────────────────────</w:t>
+        <w:t>────────────────────────────────────────────────────────────────────────</w:t>
       </w:r>
     </w:p>
     <w:tbl>
@@ -1199,14 +1341,35 @@
         <w:tblLook w:firstColumn="1" w:firstRow="1" w:lastColumn="0" w:lastRow="0" w:noHBand="0" w:noVBand="1" w:val="04A0"/>
       </w:tblPr>
       <w:tblGrid>
-        <w:gridCol w:w="4873"/>
-        <w:gridCol w:w="4873"/>
+        <w:gridCol w:w="3135"/>
+        <w:gridCol w:w="3135"/>
+        <w:gridCol w:w="3135"/>
       </w:tblGrid>
       <w:tr>
         <w:tc>
           <w:tcPr>
-            <w:tcW w:type="dxa" w:w="6803"/>
-            <w:shd w:fill="F59E0B"/>
+            <w:tcW w:type="dxa" w:w="567"/>
+            <w:shd w:fill="2B477A"/>
+          </w:tcPr>
+          <w:p>
+            <w:pPr>
+              <w:jc w:val="center"/>
+            </w:pPr>
+            <w:r>
+              <w:rPr>
+                <w:rFonts w:ascii="Calibri" w:hAnsi="Calibri"/>
+                <w:b/>
+                <w:color w:val="FFFFFF"/>
+                <w:sz w:val="18"/>
+              </w:rPr>
+              <w:t>#</w:t>
+            </w:r>
+          </w:p>
+        </w:tc>
+        <w:tc>
+          <w:tcPr>
+            <w:tcW w:type="dxa" w:w="5669"/>
+            <w:shd w:fill="2B477A"/>
           </w:tcPr>
           <w:p>
             <w:pPr>
@@ -1225,12 +1388,12 @@
         </w:tc>
         <w:tc>
           <w:tcPr>
-            <w:tcW w:type="dxa" w:w="2551"/>
-            <w:shd w:fill="F59E0B"/>
+            <w:tcW w:type="dxa" w:w="2835"/>
+            <w:shd w:fill="2B477A"/>
           </w:tcPr>
           <w:p>
             <w:pPr>
-              <w:jc w:val="right"/>
+              <w:jc w:val="left"/>
             </w:pPr>
             <w:r>
               <w:rPr>
@@ -1247,8 +1410,27 @@
       <w:tr>
         <w:tc>
           <w:tcPr>
-            <w:tcW w:type="dxa" w:w="6803"/>
-            <w:shd w:fill="FEF3C7"/>
+            <w:tcW w:type="dxa" w:w="567"/>
+            <w:shd w:fill="F3F4F6"/>
+          </w:tcPr>
+          <w:p>
+            <w:pPr>
+              <w:jc w:val="center"/>
+            </w:pPr>
+            <w:r>
+              <w:rPr>
+                <w:rFonts w:ascii="Calibri" w:hAnsi="Calibri"/>
+                <w:color w:val="6B7280"/>
+                <w:sz w:val="18"/>
+              </w:rPr>
+              <w:t>3.1</w:t>
+            </w:r>
+          </w:p>
+        </w:tc>
+        <w:tc>
+          <w:tcPr>
+            <w:tcW w:type="dxa" w:w="5669"/>
+            <w:shd w:fill="F3F4F6"/>
           </w:tcPr>
           <w:p>
             <w:r>
@@ -1277,18 +1459,15 @@
         </w:tc>
         <w:tc>
           <w:tcPr>
-            <w:tcW w:type="dxa" w:w="2551"/>
-            <w:shd w:fill="FEF3C7"/>
+            <w:tcW w:type="dxa" w:w="2835"/>
+            <w:shd w:fill="F3F4F6"/>
           </w:tcPr>
           <w:p>
-            <w:pPr>
-              <w:jc w:val="right"/>
-            </w:pPr>
             <w:r>
               <w:rPr>
                 <w:rFonts w:ascii="Calibri" w:hAnsi="Calibri"/>
                 <w:b/>
-                <w:color w:val="F59E0B"/>
+                <w:color w:val="2B477A"/>
                 <w:sz w:val="18"/>
               </w:rPr>
               <w:t>AI Enablement Team</w:t>
@@ -1299,7 +1478,25 @@
       <w:tr>
         <w:tc>
           <w:tcPr>
-            <w:tcW w:type="dxa" w:w="6803"/>
+            <w:tcW w:type="dxa" w:w="567"/>
+          </w:tcPr>
+          <w:p>
+            <w:pPr>
+              <w:jc w:val="center"/>
+            </w:pPr>
+            <w:r>
+              <w:rPr>
+                <w:rFonts w:ascii="Calibri" w:hAnsi="Calibri"/>
+                <w:color w:val="6B7280"/>
+                <w:sz w:val="18"/>
+              </w:rPr>
+              <w:t>3.2</w:t>
+            </w:r>
+          </w:p>
+        </w:tc>
+        <w:tc>
+          <w:tcPr>
+            <w:tcW w:type="dxa" w:w="5669"/>
           </w:tcPr>
           <w:p>
             <w:r>
@@ -1322,26 +1519,23 @@
                 <w:rFonts w:ascii="Calibri" w:hAnsi="Calibri"/>
                 <w:sz w:val="20"/>
               </w:rPr>
-              <w:t xml:space="preserve"> and data maturity</w:t>
+              <w:t>, data maturity &amp; regulatory impact</w:t>
             </w:r>
           </w:p>
         </w:tc>
         <w:tc>
           <w:tcPr>
-            <w:tcW w:type="dxa" w:w="2551"/>
+            <w:tcW w:type="dxa" w:w="2835"/>
           </w:tcPr>
           <w:p>
-            <w:pPr>
-              <w:jc w:val="right"/>
-            </w:pPr>
             <w:r>
               <w:rPr>
                 <w:rFonts w:ascii="Calibri" w:hAnsi="Calibri"/>
                 <w:b/>
-                <w:color w:val="F59E0B"/>
+                <w:color w:val="2B477A"/>
                 <w:sz w:val="18"/>
               </w:rPr>
-              <w:t>AI Enablement Team</w:t>
+              <w:t>AI Enablement Team + AI Champion</w:t>
             </w:r>
           </w:p>
         </w:tc>
@@ -1349,8 +1543,27 @@
       <w:tr>
         <w:tc>
           <w:tcPr>
-            <w:tcW w:type="dxa" w:w="6803"/>
-            <w:shd w:fill="FEF3C7"/>
+            <w:tcW w:type="dxa" w:w="567"/>
+            <w:shd w:fill="F3F4F6"/>
+          </w:tcPr>
+          <w:p>
+            <w:pPr>
+              <w:jc w:val="center"/>
+            </w:pPr>
+            <w:r>
+              <w:rPr>
+                <w:rFonts w:ascii="Calibri" w:hAnsi="Calibri"/>
+                <w:color w:val="6B7280"/>
+                <w:sz w:val="18"/>
+              </w:rPr>
+              <w:t>3.3</w:t>
+            </w:r>
+          </w:p>
+        </w:tc>
+        <w:tc>
+          <w:tcPr>
+            <w:tcW w:type="dxa" w:w="5669"/>
+            <w:shd w:fill="F3F4F6"/>
           </w:tcPr>
           <w:p>
             <w:r>
@@ -1378,18 +1591,15 @@
         </w:tc>
         <w:tc>
           <w:tcPr>
-            <w:tcW w:type="dxa" w:w="2551"/>
-            <w:shd w:fill="FEF3C7"/>
+            <w:tcW w:type="dxa" w:w="2835"/>
+            <w:shd w:fill="F3F4F6"/>
           </w:tcPr>
           <w:p>
-            <w:pPr>
-              <w:jc w:val="right"/>
-            </w:pPr>
             <w:r>
               <w:rPr>
                 <w:rFonts w:ascii="Calibri" w:hAnsi="Calibri"/>
                 <w:b/>
-                <w:color w:val="F59E0B"/>
+                <w:color w:val="2B477A"/>
                 <w:sz w:val="18"/>
               </w:rPr>
               <w:t>AI Enablement Team</w:t>
@@ -1400,7 +1610,25 @@
       <w:tr>
         <w:tc>
           <w:tcPr>
-            <w:tcW w:type="dxa" w:w="6803"/>
+            <w:tcW w:type="dxa" w:w="567"/>
+          </w:tcPr>
+          <w:p>
+            <w:pPr>
+              <w:jc w:val="center"/>
+            </w:pPr>
+            <w:r>
+              <w:rPr>
+                <w:rFonts w:ascii="Calibri" w:hAnsi="Calibri"/>
+                <w:color w:val="6B7280"/>
+                <w:sz w:val="18"/>
+              </w:rPr>
+              <w:t>3.4</w:t>
+            </w:r>
+          </w:p>
+        </w:tc>
+        <w:tc>
+          <w:tcPr>
+            <w:tcW w:type="dxa" w:w="5669"/>
           </w:tcPr>
           <w:p>
             <w:r>
@@ -1429,17 +1657,14 @@
         </w:tc>
         <w:tc>
           <w:tcPr>
-            <w:tcW w:type="dxa" w:w="2551"/>
+            <w:tcW w:type="dxa" w:w="2835"/>
           </w:tcPr>
           <w:p>
-            <w:pPr>
-              <w:jc w:val="right"/>
-            </w:pPr>
             <w:r>
               <w:rPr>
                 <w:rFonts w:ascii="Calibri" w:hAnsi="Calibri"/>
                 <w:b/>
-                <w:color w:val="F59E0B"/>
+                <w:color w:val="2B477A"/>
                 <w:sz w:val="18"/>
               </w:rPr>
               <w:t>AI Enablement Team</w:t>
@@ -1456,12 +1681,12 @@
         <w:tblLook w:firstColumn="1" w:firstRow="1" w:lastColumn="0" w:lastRow="0" w:noHBand="0" w:noVBand="1" w:val="04A0"/>
       </w:tblPr>
       <w:tblGrid>
-        <w:gridCol w:w="9746"/>
+        <w:gridCol w:w="9406"/>
       </w:tblGrid>
       <w:tr>
         <w:tc>
           <w:tcPr>
-            <w:tcW w:type="dxa" w:w="9746"/>
+            <w:tcW w:type="dxa" w:w="9406"/>
             <w:shd w:fill="FEF3C7"/>
           </w:tcPr>
           <w:p>
@@ -1472,10 +1697,10 @@
               <w:rPr>
                 <w:rFonts w:ascii="Calibri" w:hAnsi="Calibri"/>
                 <w:b/>
-                <w:color w:val="F59E0B"/>
-                <w:sz w:val="24"/>
+                <w:color w:val="92400E"/>
+                <w:sz w:val="22"/>
               </w:rPr>
-              <w:t>⚠  RELEASE GATE</w:t>
+              <w:t>RELEASE GATE</w:t>
             </w:r>
           </w:p>
           <w:p>
@@ -1486,7 +1711,7 @@
               <w:rPr>
                 <w:rFonts w:ascii="Calibri" w:hAnsi="Calibri"/>
                 <w:color w:val="6B7280"/>
-                <w:sz w:val="19"/>
+                <w:sz w:val="18"/>
               </w:rPr>
               <w:t>Approved to proceed?  Yes → continue to build   |   No → return to ideation</w:t>
             </w:r>
@@ -1505,9 +1730,6 @@
         <w:pStyle w:val="Heading1"/>
       </w:pPr>
       <w:r>
-        <w:rPr>
-          <w:color w:val="F43F5E"/>
-        </w:rPr>
         <w:t>Step 4: Project Setup &amp; Resource Allocation</w:t>
       </w:r>
     </w:p>
@@ -1516,10 +1738,10 @@
         <w:rPr>
           <w:rFonts w:ascii="Calibri" w:hAnsi="Calibri"/>
           <w:b/>
-          <w:color w:val="F43F5E"/>
+          <w:color w:val="6B7280"/>
           <w:sz w:val="18"/>
         </w:rPr>
-        <w:t>●  SETUP</w:t>
+        <w:t>SETUP</w:t>
       </w:r>
     </w:p>
     <w:p>
@@ -1528,10 +1750,10 @@
       </w:pPr>
       <w:r>
         <w:rPr>
-          <w:color w:val="F43F5E"/>
-          <w:sz w:val="12"/>
+          <w:color w:val="D1D5DB"/>
+          <w:sz w:val="10"/>
         </w:rPr>
-        <w:t>─────────────────────────────────────────────────────────────────</w:t>
+        <w:t>────────────────────────────────────────────────────────────────────────</w:t>
       </w:r>
     </w:p>
     <w:tbl>
@@ -1542,14 +1764,35 @@
         <w:tblLook w:firstColumn="1" w:firstRow="1" w:lastColumn="0" w:lastRow="0" w:noHBand="0" w:noVBand="1" w:val="04A0"/>
       </w:tblPr>
       <w:tblGrid>
-        <w:gridCol w:w="4873"/>
-        <w:gridCol w:w="4873"/>
+        <w:gridCol w:w="3135"/>
+        <w:gridCol w:w="3135"/>
+        <w:gridCol w:w="3135"/>
       </w:tblGrid>
       <w:tr>
         <w:tc>
           <w:tcPr>
-            <w:tcW w:type="dxa" w:w="6803"/>
-            <w:shd w:fill="F43F5E"/>
+            <w:tcW w:type="dxa" w:w="567"/>
+            <w:shd w:fill="2B477A"/>
+          </w:tcPr>
+          <w:p>
+            <w:pPr>
+              <w:jc w:val="center"/>
+            </w:pPr>
+            <w:r>
+              <w:rPr>
+                <w:rFonts w:ascii="Calibri" w:hAnsi="Calibri"/>
+                <w:b/>
+                <w:color w:val="FFFFFF"/>
+                <w:sz w:val="18"/>
+              </w:rPr>
+              <w:t>#</w:t>
+            </w:r>
+          </w:p>
+        </w:tc>
+        <w:tc>
+          <w:tcPr>
+            <w:tcW w:type="dxa" w:w="5669"/>
+            <w:shd w:fill="2B477A"/>
           </w:tcPr>
           <w:p>
             <w:pPr>
@@ -1568,12 +1811,12 @@
         </w:tc>
         <w:tc>
           <w:tcPr>
-            <w:tcW w:type="dxa" w:w="2551"/>
-            <w:shd w:fill="F43F5E"/>
+            <w:tcW w:type="dxa" w:w="2835"/>
+            <w:shd w:fill="2B477A"/>
           </w:tcPr>
           <w:p>
             <w:pPr>
-              <w:jc w:val="right"/>
+              <w:jc w:val="left"/>
             </w:pPr>
             <w:r>
               <w:rPr>
@@ -1590,8 +1833,27 @@
       <w:tr>
         <w:tc>
           <w:tcPr>
-            <w:tcW w:type="dxa" w:w="6803"/>
-            <w:shd w:fill="FFE4E6"/>
+            <w:tcW w:type="dxa" w:w="567"/>
+            <w:shd w:fill="F3F4F6"/>
+          </w:tcPr>
+          <w:p>
+            <w:pPr>
+              <w:jc w:val="center"/>
+            </w:pPr>
+            <w:r>
+              <w:rPr>
+                <w:rFonts w:ascii="Calibri" w:hAnsi="Calibri"/>
+                <w:color w:val="6B7280"/>
+                <w:sz w:val="18"/>
+              </w:rPr>
+              <w:t>4.1</w:t>
+            </w:r>
+          </w:p>
+        </w:tc>
+        <w:tc>
+          <w:tcPr>
+            <w:tcW w:type="dxa" w:w="5669"/>
+            <w:shd w:fill="F3F4F6"/>
           </w:tcPr>
           <w:p>
             <w:r>
@@ -1619,18 +1881,15 @@
         </w:tc>
         <w:tc>
           <w:tcPr>
-            <w:tcW w:type="dxa" w:w="2551"/>
-            <w:shd w:fill="FFE4E6"/>
+            <w:tcW w:type="dxa" w:w="2835"/>
+            <w:shd w:fill="F3F4F6"/>
           </w:tcPr>
           <w:p>
-            <w:pPr>
-              <w:jc w:val="right"/>
-            </w:pPr>
             <w:r>
               <w:rPr>
                 <w:rFonts w:ascii="Calibri" w:hAnsi="Calibri"/>
                 <w:b/>
-                <w:color w:val="F43F5E"/>
+                <w:color w:val="2B477A"/>
                 <w:sz w:val="18"/>
               </w:rPr>
               <w:t>Business Sponsor</w:t>
@@ -1641,7 +1900,25 @@
       <w:tr>
         <w:tc>
           <w:tcPr>
-            <w:tcW w:type="dxa" w:w="6803"/>
+            <w:tcW w:type="dxa" w:w="567"/>
+          </w:tcPr>
+          <w:p>
+            <w:pPr>
+              <w:jc w:val="center"/>
+            </w:pPr>
+            <w:r>
+              <w:rPr>
+                <w:rFonts w:ascii="Calibri" w:hAnsi="Calibri"/>
+                <w:color w:val="6B7280"/>
+                <w:sz w:val="18"/>
+              </w:rPr>
+              <w:t>4.2</w:t>
+            </w:r>
+          </w:p>
+        </w:tc>
+        <w:tc>
+          <w:tcPr>
+            <w:tcW w:type="dxa" w:w="5669"/>
           </w:tcPr>
           <w:p>
             <w:r>
@@ -1669,17 +1946,14 @@
         </w:tc>
         <w:tc>
           <w:tcPr>
-            <w:tcW w:type="dxa" w:w="2551"/>
+            <w:tcW w:type="dxa" w:w="2835"/>
           </w:tcPr>
           <w:p>
-            <w:pPr>
-              <w:jc w:val="right"/>
-            </w:pPr>
             <w:r>
               <w:rPr>
                 <w:rFonts w:ascii="Calibri" w:hAnsi="Calibri"/>
                 <w:b/>
-                <w:color w:val="F43F5E"/>
+                <w:color w:val="2B477A"/>
                 <w:sz w:val="18"/>
               </w:rPr>
               <w:t>AI Enablement Team</w:t>
@@ -1690,8 +1964,27 @@
       <w:tr>
         <w:tc>
           <w:tcPr>
-            <w:tcW w:type="dxa" w:w="6803"/>
-            <w:shd w:fill="FFE4E6"/>
+            <w:tcW w:type="dxa" w:w="567"/>
+            <w:shd w:fill="F3F4F6"/>
+          </w:tcPr>
+          <w:p>
+            <w:pPr>
+              <w:jc w:val="center"/>
+            </w:pPr>
+            <w:r>
+              <w:rPr>
+                <w:rFonts w:ascii="Calibri" w:hAnsi="Calibri"/>
+                <w:color w:val="6B7280"/>
+                <w:sz w:val="18"/>
+              </w:rPr>
+              <w:t>4.3</w:t>
+            </w:r>
+          </w:p>
+        </w:tc>
+        <w:tc>
+          <w:tcPr>
+            <w:tcW w:type="dxa" w:w="5669"/>
+            <w:shd w:fill="F3F4F6"/>
           </w:tcPr>
           <w:p>
             <w:r>
@@ -1719,18 +2012,15 @@
         </w:tc>
         <w:tc>
           <w:tcPr>
-            <w:tcW w:type="dxa" w:w="2551"/>
-            <w:shd w:fill="FFE4E6"/>
+            <w:tcW w:type="dxa" w:w="2835"/>
+            <w:shd w:fill="F3F4F6"/>
           </w:tcPr>
           <w:p>
-            <w:pPr>
-              <w:jc w:val="right"/>
-            </w:pPr>
             <w:r>
               <w:rPr>
                 <w:rFonts w:ascii="Calibri" w:hAnsi="Calibri"/>
                 <w:b/>
-                <w:color w:val="F43F5E"/>
+                <w:color w:val="2B477A"/>
                 <w:sz w:val="18"/>
               </w:rPr>
               <w:t>AI Enablement Team</w:t>
@@ -1741,7 +2031,25 @@
       <w:tr>
         <w:tc>
           <w:tcPr>
-            <w:tcW w:type="dxa" w:w="6803"/>
+            <w:tcW w:type="dxa" w:w="567"/>
+          </w:tcPr>
+          <w:p>
+            <w:pPr>
+              <w:jc w:val="center"/>
+            </w:pPr>
+            <w:r>
+              <w:rPr>
+                <w:rFonts w:ascii="Calibri" w:hAnsi="Calibri"/>
+                <w:color w:val="6B7280"/>
+                <w:sz w:val="18"/>
+              </w:rPr>
+              <w:t>4.4</w:t>
+            </w:r>
+          </w:p>
+        </w:tc>
+        <w:tc>
+          <w:tcPr>
+            <w:tcW w:type="dxa" w:w="5669"/>
           </w:tcPr>
           <w:p>
             <w:r>
@@ -1769,17 +2077,14 @@
         </w:tc>
         <w:tc>
           <w:tcPr>
-            <w:tcW w:type="dxa" w:w="2551"/>
+            <w:tcW w:type="dxa" w:w="2835"/>
           </w:tcPr>
           <w:p>
-            <w:pPr>
-              <w:jc w:val="right"/>
-            </w:pPr>
             <w:r>
               <w:rPr>
                 <w:rFonts w:ascii="Calibri" w:hAnsi="Calibri"/>
                 <w:b/>
-                <w:color w:val="F43F5E"/>
+                <w:color w:val="2B477A"/>
                 <w:sz w:val="18"/>
               </w:rPr>
               <w:t>AI Champion + AI Fwd Engineer</w:t>
@@ -1799,9 +2104,6 @@
         <w:pStyle w:val="Heading1"/>
       </w:pPr>
       <w:r>
-        <w:rPr>
-          <w:color w:val="8B5CF6"/>
-        </w:rPr>
         <w:t>Step 5: Define the MVP &amp; Build</w:t>
       </w:r>
     </w:p>
@@ -1810,10 +2112,10 @@
         <w:rPr>
           <w:rFonts w:ascii="Calibri" w:hAnsi="Calibri"/>
           <w:b/>
-          <w:color w:val="8B5CF6"/>
+          <w:color w:val="6B7280"/>
           <w:sz w:val="18"/>
         </w:rPr>
-        <w:t>●  BUILD</w:t>
+        <w:t>BUILD</w:t>
       </w:r>
     </w:p>
     <w:p>
@@ -1822,10 +2124,10 @@
       </w:pPr>
       <w:r>
         <w:rPr>
-          <w:color w:val="8B5CF6"/>
-          <w:sz w:val="12"/>
+          <w:color w:val="D1D5DB"/>
+          <w:sz w:val="10"/>
         </w:rPr>
-        <w:t>─────────────────────────────────────────────────────────────────</w:t>
+        <w:t>────────────────────────────────────────────────────────────────────────</w:t>
       </w:r>
     </w:p>
     <w:tbl>
@@ -1836,14 +2138,35 @@
         <w:tblLook w:firstColumn="1" w:firstRow="1" w:lastColumn="0" w:lastRow="0" w:noHBand="0" w:noVBand="1" w:val="04A0"/>
       </w:tblPr>
       <w:tblGrid>
-        <w:gridCol w:w="4873"/>
-        <w:gridCol w:w="4873"/>
+        <w:gridCol w:w="3135"/>
+        <w:gridCol w:w="3135"/>
+        <w:gridCol w:w="3135"/>
       </w:tblGrid>
       <w:tr>
         <w:tc>
           <w:tcPr>
-            <w:tcW w:type="dxa" w:w="6803"/>
-            <w:shd w:fill="8B5CF6"/>
+            <w:tcW w:type="dxa" w:w="567"/>
+            <w:shd w:fill="2B477A"/>
+          </w:tcPr>
+          <w:p>
+            <w:pPr>
+              <w:jc w:val="center"/>
+            </w:pPr>
+            <w:r>
+              <w:rPr>
+                <w:rFonts w:ascii="Calibri" w:hAnsi="Calibri"/>
+                <w:b/>
+                <w:color w:val="FFFFFF"/>
+                <w:sz w:val="18"/>
+              </w:rPr>
+              <w:t>#</w:t>
+            </w:r>
+          </w:p>
+        </w:tc>
+        <w:tc>
+          <w:tcPr>
+            <w:tcW w:type="dxa" w:w="5669"/>
+            <w:shd w:fill="2B477A"/>
           </w:tcPr>
           <w:p>
             <w:pPr>
@@ -1862,12 +2185,12 @@
         </w:tc>
         <w:tc>
           <w:tcPr>
-            <w:tcW w:type="dxa" w:w="2551"/>
-            <w:shd w:fill="8B5CF6"/>
+            <w:tcW w:type="dxa" w:w="2835"/>
+            <w:shd w:fill="2B477A"/>
           </w:tcPr>
           <w:p>
             <w:pPr>
-              <w:jc w:val="right"/>
+              <w:jc w:val="left"/>
             </w:pPr>
             <w:r>
               <w:rPr>
@@ -1884,8 +2207,27 @@
       <w:tr>
         <w:tc>
           <w:tcPr>
-            <w:tcW w:type="dxa" w:w="6803"/>
-            <w:shd w:fill="EDE9FE"/>
+            <w:tcW w:type="dxa" w:w="567"/>
+            <w:shd w:fill="F3F4F6"/>
+          </w:tcPr>
+          <w:p>
+            <w:pPr>
+              <w:jc w:val="center"/>
+            </w:pPr>
+            <w:r>
+              <w:rPr>
+                <w:rFonts w:ascii="Calibri" w:hAnsi="Calibri"/>
+                <w:color w:val="6B7280"/>
+                <w:sz w:val="18"/>
+              </w:rPr>
+              <w:t>5.1</w:t>
+            </w:r>
+          </w:p>
+        </w:tc>
+        <w:tc>
+          <w:tcPr>
+            <w:tcW w:type="dxa" w:w="5669"/>
+            <w:shd w:fill="F3F4F6"/>
           </w:tcPr>
           <w:p>
             <w:r>
@@ -1913,18 +2255,15 @@
         </w:tc>
         <w:tc>
           <w:tcPr>
-            <w:tcW w:type="dxa" w:w="2551"/>
-            <w:shd w:fill="EDE9FE"/>
+            <w:tcW w:type="dxa" w:w="2835"/>
+            <w:shd w:fill="F3F4F6"/>
           </w:tcPr>
           <w:p>
-            <w:pPr>
-              <w:jc w:val="right"/>
-            </w:pPr>
             <w:r>
               <w:rPr>
                 <w:rFonts w:ascii="Calibri" w:hAnsi="Calibri"/>
                 <w:b/>
-                <w:color w:val="8B5CF6"/>
+                <w:color w:val="2B477A"/>
                 <w:sz w:val="18"/>
               </w:rPr>
               <w:t>AI Fwd Engineer + AI Champion</w:t>
@@ -1935,7 +2274,25 @@
       <w:tr>
         <w:tc>
           <w:tcPr>
-            <w:tcW w:type="dxa" w:w="6803"/>
+            <w:tcW w:type="dxa" w:w="567"/>
+          </w:tcPr>
+          <w:p>
+            <w:pPr>
+              <w:jc w:val="center"/>
+            </w:pPr>
+            <w:r>
+              <w:rPr>
+                <w:rFonts w:ascii="Calibri" w:hAnsi="Calibri"/>
+                <w:color w:val="6B7280"/>
+                <w:sz w:val="18"/>
+              </w:rPr>
+              <w:t>5.2</w:t>
+            </w:r>
+          </w:p>
+        </w:tc>
+        <w:tc>
+          <w:tcPr>
+            <w:tcW w:type="dxa" w:w="5669"/>
           </w:tcPr>
           <w:p>
             <w:r>
@@ -1964,20 +2321,17 @@
         </w:tc>
         <w:tc>
           <w:tcPr>
-            <w:tcW w:type="dxa" w:w="2551"/>
+            <w:tcW w:type="dxa" w:w="2835"/>
           </w:tcPr>
           <w:p>
-            <w:pPr>
-              <w:jc w:val="right"/>
-            </w:pPr>
             <w:r>
               <w:rPr>
                 <w:rFonts w:ascii="Calibri" w:hAnsi="Calibri"/>
                 <w:b/>
-                <w:color w:val="8B5CF6"/>
+                <w:color w:val="2B477A"/>
                 <w:sz w:val="18"/>
               </w:rPr>
-              <w:t>AI Forward Engineer</w:t>
+              <w:t>AI Fwd Engineer + AI Enablement Team</w:t>
             </w:r>
           </w:p>
         </w:tc>
@@ -1985,8 +2339,27 @@
       <w:tr>
         <w:tc>
           <w:tcPr>
-            <w:tcW w:type="dxa" w:w="6803"/>
-            <w:shd w:fill="EDE9FE"/>
+            <w:tcW w:type="dxa" w:w="567"/>
+            <w:shd w:fill="F3F4F6"/>
+          </w:tcPr>
+          <w:p>
+            <w:pPr>
+              <w:jc w:val="center"/>
+            </w:pPr>
+            <w:r>
+              <w:rPr>
+                <w:rFonts w:ascii="Calibri" w:hAnsi="Calibri"/>
+                <w:color w:val="6B7280"/>
+                <w:sz w:val="18"/>
+              </w:rPr>
+              <w:t>5.3</w:t>
+            </w:r>
+          </w:p>
+        </w:tc>
+        <w:tc>
+          <w:tcPr>
+            <w:tcW w:type="dxa" w:w="5669"/>
+            <w:shd w:fill="F3F4F6"/>
           </w:tcPr>
           <w:p>
             <w:r>
@@ -2015,18 +2388,15 @@
         </w:tc>
         <w:tc>
           <w:tcPr>
-            <w:tcW w:type="dxa" w:w="2551"/>
-            <w:shd w:fill="EDE9FE"/>
+            <w:tcW w:type="dxa" w:w="2835"/>
+            <w:shd w:fill="F3F4F6"/>
           </w:tcPr>
           <w:p>
-            <w:pPr>
-              <w:jc w:val="right"/>
-            </w:pPr>
             <w:r>
               <w:rPr>
                 <w:rFonts w:ascii="Calibri" w:hAnsi="Calibri"/>
                 <w:b/>
-                <w:color w:val="8B5CF6"/>
+                <w:color w:val="2B477A"/>
                 <w:sz w:val="18"/>
               </w:rPr>
               <w:t>AI Champion</w:t>
@@ -2037,7 +2407,25 @@
       <w:tr>
         <w:tc>
           <w:tcPr>
-            <w:tcW w:type="dxa" w:w="6803"/>
+            <w:tcW w:type="dxa" w:w="567"/>
+          </w:tcPr>
+          <w:p>
+            <w:pPr>
+              <w:jc w:val="center"/>
+            </w:pPr>
+            <w:r>
+              <w:rPr>
+                <w:rFonts w:ascii="Calibri" w:hAnsi="Calibri"/>
+                <w:color w:val="6B7280"/>
+                <w:sz w:val="18"/>
+              </w:rPr>
+              <w:t>5.4</w:t>
+            </w:r>
+          </w:p>
+        </w:tc>
+        <w:tc>
+          <w:tcPr>
+            <w:tcW w:type="dxa" w:w="5669"/>
           </w:tcPr>
           <w:p>
             <w:r>
@@ -2066,17 +2454,14 @@
         </w:tc>
         <w:tc>
           <w:tcPr>
-            <w:tcW w:type="dxa" w:w="2551"/>
+            <w:tcW w:type="dxa" w:w="2835"/>
           </w:tcPr>
           <w:p>
-            <w:pPr>
-              <w:jc w:val="right"/>
-            </w:pPr>
             <w:r>
               <w:rPr>
                 <w:rFonts w:ascii="Calibri" w:hAnsi="Calibri"/>
                 <w:b/>
-                <w:color w:val="8B5CF6"/>
+                <w:color w:val="2B477A"/>
                 <w:sz w:val="18"/>
               </w:rPr>
               <w:t>AI Forward Engineer</w:t>
@@ -2087,8 +2472,27 @@
       <w:tr>
         <w:tc>
           <w:tcPr>
-            <w:tcW w:type="dxa" w:w="6803"/>
-            <w:shd w:fill="EDE9FE"/>
+            <w:tcW w:type="dxa" w:w="567"/>
+            <w:shd w:fill="F3F4F6"/>
+          </w:tcPr>
+          <w:p>
+            <w:pPr>
+              <w:jc w:val="center"/>
+            </w:pPr>
+            <w:r>
+              <w:rPr>
+                <w:rFonts w:ascii="Calibri" w:hAnsi="Calibri"/>
+                <w:color w:val="6B7280"/>
+                <w:sz w:val="18"/>
+              </w:rPr>
+              <w:t>5.5</w:t>
+            </w:r>
+          </w:p>
+        </w:tc>
+        <w:tc>
+          <w:tcPr>
+            <w:tcW w:type="dxa" w:w="5669"/>
+            <w:shd w:fill="F3F4F6"/>
           </w:tcPr>
           <w:p>
             <w:r>
@@ -2116,18 +2520,15 @@
         </w:tc>
         <w:tc>
           <w:tcPr>
-            <w:tcW w:type="dxa" w:w="2551"/>
-            <w:shd w:fill="EDE9FE"/>
+            <w:tcW w:type="dxa" w:w="2835"/>
+            <w:shd w:fill="F3F4F6"/>
           </w:tcPr>
           <w:p>
-            <w:pPr>
-              <w:jc w:val="right"/>
-            </w:pPr>
             <w:r>
               <w:rPr>
                 <w:rFonts w:ascii="Calibri" w:hAnsi="Calibri"/>
                 <w:b/>
-                <w:color w:val="8B5CF6"/>
+                <w:color w:val="2B477A"/>
                 <w:sz w:val="18"/>
               </w:rPr>
               <w:t>AI Enablement Team</w:t>
@@ -2144,13 +2545,13 @@
         <w:tblLook w:firstColumn="1" w:firstRow="1" w:lastColumn="0" w:lastRow="0" w:noHBand="0" w:noVBand="1" w:val="04A0"/>
       </w:tblPr>
       <w:tblGrid>
-        <w:gridCol w:w="9746"/>
+        <w:gridCol w:w="9406"/>
       </w:tblGrid>
       <w:tr>
         <w:tc>
           <w:tcPr>
-            <w:tcW w:type="dxa" w:w="9746"/>
-            <w:shd w:fill="FEE2E2"/>
+            <w:tcW w:type="dxa" w:w="9406"/>
+            <w:shd w:fill="FEF3C7"/>
           </w:tcPr>
           <w:p>
             <w:pPr>
@@ -2160,10 +2561,10 @@
               <w:rPr>
                 <w:rFonts w:ascii="Calibri" w:hAnsi="Calibri"/>
                 <w:b/>
-                <w:color w:val="DC2626"/>
-                <w:sz w:val="24"/>
+                <w:color w:val="92400E"/>
+                <w:sz w:val="22"/>
               </w:rPr>
-              <w:t>⚠  GOVERNANCE GATE</w:t>
+              <w:t>GOVERNANCE GATE</w:t>
             </w:r>
           </w:p>
           <w:p>
@@ -2174,9 +2575,9 @@
               <w:rPr>
                 <w:rFonts w:ascii="Calibri" w:hAnsi="Calibri"/>
                 <w:color w:val="6B7280"/>
-                <w:sz w:val="19"/>
+                <w:sz w:val="18"/>
               </w:rPr>
-              <w:t>AI Governance Evaluation  •  Compliance Checks  •  Data Security Review  •  Model Risk Validation</w:t>
+              <w:t>AI Governance  •  Compliance Checks  •  Data Security Review  •  Model Risk Validation</w:t>
             </w:r>
           </w:p>
         </w:tc>
@@ -2193,9 +2594,6 @@
         <w:pStyle w:val="Heading1"/>
       </w:pPr>
       <w:r>
-        <w:rPr>
-          <w:color w:val="06B6D4"/>
-        </w:rPr>
         <w:t>Step 6: GTM Ready — Package the Solution</w:t>
       </w:r>
     </w:p>
@@ -2204,10 +2602,10 @@
         <w:rPr>
           <w:rFonts w:ascii="Calibri" w:hAnsi="Calibri"/>
           <w:b/>
-          <w:color w:val="06B6D4"/>
+          <w:color w:val="6B7280"/>
           <w:sz w:val="18"/>
         </w:rPr>
-        <w:t>●  GTM READY</w:t>
+        <w:t>GTM READY</w:t>
       </w:r>
     </w:p>
     <w:p>
@@ -2216,10 +2614,10 @@
       </w:pPr>
       <w:r>
         <w:rPr>
-          <w:color w:val="06B6D4"/>
-          <w:sz w:val="12"/>
+          <w:color w:val="D1D5DB"/>
+          <w:sz w:val="10"/>
         </w:rPr>
-        <w:t>─────────────────────────────────────────────────────────────────</w:t>
+        <w:t>────────────────────────────────────────────────────────────────────────</w:t>
       </w:r>
     </w:p>
     <w:tbl>
@@ -2230,14 +2628,35 @@
         <w:tblLook w:firstColumn="1" w:firstRow="1" w:lastColumn="0" w:lastRow="0" w:noHBand="0" w:noVBand="1" w:val="04A0"/>
       </w:tblPr>
       <w:tblGrid>
-        <w:gridCol w:w="4873"/>
-        <w:gridCol w:w="4873"/>
+        <w:gridCol w:w="3135"/>
+        <w:gridCol w:w="3135"/>
+        <w:gridCol w:w="3135"/>
       </w:tblGrid>
       <w:tr>
         <w:tc>
           <w:tcPr>
-            <w:tcW w:type="dxa" w:w="6803"/>
-            <w:shd w:fill="06B6D4"/>
+            <w:tcW w:type="dxa" w:w="567"/>
+            <w:shd w:fill="2B477A"/>
+          </w:tcPr>
+          <w:p>
+            <w:pPr>
+              <w:jc w:val="center"/>
+            </w:pPr>
+            <w:r>
+              <w:rPr>
+                <w:rFonts w:ascii="Calibri" w:hAnsi="Calibri"/>
+                <w:b/>
+                <w:color w:val="FFFFFF"/>
+                <w:sz w:val="18"/>
+              </w:rPr>
+              <w:t>#</w:t>
+            </w:r>
+          </w:p>
+        </w:tc>
+        <w:tc>
+          <w:tcPr>
+            <w:tcW w:type="dxa" w:w="5669"/>
+            <w:shd w:fill="2B477A"/>
           </w:tcPr>
           <w:p>
             <w:pPr>
@@ -2256,12 +2675,12 @@
         </w:tc>
         <w:tc>
           <w:tcPr>
-            <w:tcW w:type="dxa" w:w="2551"/>
-            <w:shd w:fill="06B6D4"/>
+            <w:tcW w:type="dxa" w:w="2835"/>
+            <w:shd w:fill="2B477A"/>
           </w:tcPr>
           <w:p>
             <w:pPr>
-              <w:jc w:val="right"/>
+              <w:jc w:val="left"/>
             </w:pPr>
             <w:r>
               <w:rPr>
@@ -2278,8 +2697,27 @@
       <w:tr>
         <w:tc>
           <w:tcPr>
-            <w:tcW w:type="dxa" w:w="6803"/>
-            <w:shd w:fill="CFFAFE"/>
+            <w:tcW w:type="dxa" w:w="567"/>
+            <w:shd w:fill="F3F4F6"/>
+          </w:tcPr>
+          <w:p>
+            <w:pPr>
+              <w:jc w:val="center"/>
+            </w:pPr>
+            <w:r>
+              <w:rPr>
+                <w:rFonts w:ascii="Calibri" w:hAnsi="Calibri"/>
+                <w:color w:val="6B7280"/>
+                <w:sz w:val="18"/>
+              </w:rPr>
+              <w:t>6.1</w:t>
+            </w:r>
+          </w:p>
+        </w:tc>
+        <w:tc>
+          <w:tcPr>
+            <w:tcW w:type="dxa" w:w="5669"/>
+            <w:shd w:fill="F3F4F6"/>
           </w:tcPr>
           <w:p>
             <w:r>
@@ -2308,18 +2746,15 @@
         </w:tc>
         <w:tc>
           <w:tcPr>
-            <w:tcW w:type="dxa" w:w="2551"/>
-            <w:shd w:fill="CFFAFE"/>
+            <w:tcW w:type="dxa" w:w="2835"/>
+            <w:shd w:fill="F3F4F6"/>
           </w:tcPr>
           <w:p>
-            <w:pPr>
-              <w:jc w:val="right"/>
-            </w:pPr>
             <w:r>
               <w:rPr>
                 <w:rFonts w:ascii="Calibri" w:hAnsi="Calibri"/>
                 <w:b/>
-                <w:color w:val="06B6D4"/>
+                <w:color w:val="2B477A"/>
                 <w:sz w:val="18"/>
               </w:rPr>
               <w:t>AI Fwd Engineer + AI Champion</w:t>
@@ -2330,7 +2765,25 @@
       <w:tr>
         <w:tc>
           <w:tcPr>
-            <w:tcW w:type="dxa" w:w="6803"/>
+            <w:tcW w:type="dxa" w:w="567"/>
+          </w:tcPr>
+          <w:p>
+            <w:pPr>
+              <w:jc w:val="center"/>
+            </w:pPr>
+            <w:r>
+              <w:rPr>
+                <w:rFonts w:ascii="Calibri" w:hAnsi="Calibri"/>
+                <w:color w:val="6B7280"/>
+                <w:sz w:val="18"/>
+              </w:rPr>
+              <w:t>6.2</w:t>
+            </w:r>
+          </w:p>
+        </w:tc>
+        <w:tc>
+          <w:tcPr>
+            <w:tcW w:type="dxa" w:w="5669"/>
           </w:tcPr>
           <w:p>
             <w:r>
@@ -2359,17 +2812,14 @@
         </w:tc>
         <w:tc>
           <w:tcPr>
-            <w:tcW w:type="dxa" w:w="2551"/>
+            <w:tcW w:type="dxa" w:w="2835"/>
           </w:tcPr>
           <w:p>
-            <w:pPr>
-              <w:jc w:val="right"/>
-            </w:pPr>
             <w:r>
               <w:rPr>
                 <w:rFonts w:ascii="Calibri" w:hAnsi="Calibri"/>
                 <w:b/>
-                <w:color w:val="06B6D4"/>
+                <w:color w:val="2B477A"/>
                 <w:sz w:val="18"/>
               </w:rPr>
               <w:t>AI Fwd Engineer + AI Champion</w:t>
@@ -2380,8 +2830,27 @@
       <w:tr>
         <w:tc>
           <w:tcPr>
-            <w:tcW w:type="dxa" w:w="6803"/>
-            <w:shd w:fill="CFFAFE"/>
+            <w:tcW w:type="dxa" w:w="567"/>
+            <w:shd w:fill="F3F4F6"/>
+          </w:tcPr>
+          <w:p>
+            <w:pPr>
+              <w:jc w:val="center"/>
+            </w:pPr>
+            <w:r>
+              <w:rPr>
+                <w:rFonts w:ascii="Calibri" w:hAnsi="Calibri"/>
+                <w:color w:val="6B7280"/>
+                <w:sz w:val="18"/>
+              </w:rPr>
+              <w:t>6.3</w:t>
+            </w:r>
+          </w:p>
+        </w:tc>
+        <w:tc>
+          <w:tcPr>
+            <w:tcW w:type="dxa" w:w="5669"/>
+            <w:shd w:fill="F3F4F6"/>
           </w:tcPr>
           <w:p>
             <w:r>
@@ -2410,18 +2879,15 @@
         </w:tc>
         <w:tc>
           <w:tcPr>
-            <w:tcW w:type="dxa" w:w="2551"/>
-            <w:shd w:fill="CFFAFE"/>
+            <w:tcW w:type="dxa" w:w="2835"/>
+            <w:shd w:fill="F3F4F6"/>
           </w:tcPr>
           <w:p>
-            <w:pPr>
-              <w:jc w:val="right"/>
-            </w:pPr>
             <w:r>
               <w:rPr>
                 <w:rFonts w:ascii="Calibri" w:hAnsi="Calibri"/>
                 <w:b/>
-                <w:color w:val="06B6D4"/>
+                <w:color w:val="2B477A"/>
                 <w:sz w:val="18"/>
               </w:rPr>
               <w:t>AI Champion + Sales</w:t>
@@ -2432,7 +2898,25 @@
       <w:tr>
         <w:tc>
           <w:tcPr>
-            <w:tcW w:type="dxa" w:w="6803"/>
+            <w:tcW w:type="dxa" w:w="567"/>
+          </w:tcPr>
+          <w:p>
+            <w:pPr>
+              <w:jc w:val="center"/>
+            </w:pPr>
+            <w:r>
+              <w:rPr>
+                <w:rFonts w:ascii="Calibri" w:hAnsi="Calibri"/>
+                <w:color w:val="6B7280"/>
+                <w:sz w:val="18"/>
+              </w:rPr>
+              <w:t>6.4</w:t>
+            </w:r>
+          </w:p>
+        </w:tc>
+        <w:tc>
+          <w:tcPr>
+            <w:tcW w:type="dxa" w:w="5669"/>
           </w:tcPr>
           <w:p>
             <w:r>
@@ -2461,17 +2945,14 @@
         </w:tc>
         <w:tc>
           <w:tcPr>
-            <w:tcW w:type="dxa" w:w="2551"/>
+            <w:tcW w:type="dxa" w:w="2835"/>
           </w:tcPr>
           <w:p>
-            <w:pPr>
-              <w:jc w:val="right"/>
-            </w:pPr>
             <w:r>
               <w:rPr>
                 <w:rFonts w:ascii="Calibri" w:hAnsi="Calibri"/>
                 <w:b/>
-                <w:color w:val="06B6D4"/>
+                <w:color w:val="2B477A"/>
                 <w:sz w:val="18"/>
               </w:rPr>
               <w:t>Domain Leader + Sales</w:t>
@@ -2482,8 +2963,27 @@
       <w:tr>
         <w:tc>
           <w:tcPr>
-            <w:tcW w:type="dxa" w:w="6803"/>
-            <w:shd w:fill="CFFAFE"/>
+            <w:tcW w:type="dxa" w:w="567"/>
+            <w:shd w:fill="F3F4F6"/>
+          </w:tcPr>
+          <w:p>
+            <w:pPr>
+              <w:jc w:val="center"/>
+            </w:pPr>
+            <w:r>
+              <w:rPr>
+                <w:rFonts w:ascii="Calibri" w:hAnsi="Calibri"/>
+                <w:color w:val="6B7280"/>
+                <w:sz w:val="18"/>
+              </w:rPr>
+              <w:t>6.5</w:t>
+            </w:r>
+          </w:p>
+        </w:tc>
+        <w:tc>
+          <w:tcPr>
+            <w:tcW w:type="dxa" w:w="5669"/>
+            <w:shd w:fill="F3F4F6"/>
           </w:tcPr>
           <w:p>
             <w:r>
@@ -2512,18 +3012,15 @@
         </w:tc>
         <w:tc>
           <w:tcPr>
-            <w:tcW w:type="dxa" w:w="2551"/>
-            <w:shd w:fill="CFFAFE"/>
+            <w:tcW w:type="dxa" w:w="2835"/>
+            <w:shd w:fill="F3F4F6"/>
           </w:tcPr>
           <w:p>
-            <w:pPr>
-              <w:jc w:val="right"/>
-            </w:pPr>
             <w:r>
               <w:rPr>
                 <w:rFonts w:ascii="Calibri" w:hAnsi="Calibri"/>
                 <w:b/>
-                <w:color w:val="06B6D4"/>
+                <w:color w:val="2B477A"/>
                 <w:sz w:val="18"/>
               </w:rPr>
               <w:t>Sales + AI Enablement Team</w:t>
@@ -2537,17 +3034,17 @@
       <w:r>
         <w:rPr>
           <w:b/>
-          <w:color w:val="06B6D4"/>
+          <w:color w:val="2B477A"/>
           <w:sz w:val="20"/>
         </w:rPr>
-        <w:t xml:space="preserve">Deliverables checklist: </w:t>
+        <w:t xml:space="preserve">Deliverables: </w:t>
       </w:r>
       <w:r>
         <w:rPr>
           <w:color w:val="6B7280"/>
-          <w:sz w:val="20"/>
+          <w:sz w:val="19"/>
         </w:rPr>
-        <w:t>Polished demo  |  Demo script  |  Mock data  |  Demo video  |  One-pager  |  Talk track  |  Pricing template  |  Target account list</w:t>
+        <w:t>Demo script  |  Mock data  |  Demo video  |  One-pager  |  Talk track  |  Pricing template  |  Target account list</w:t>
       </w:r>
     </w:p>
     <w:p>
@@ -2560,9 +3057,6 @@
         <w:pStyle w:val="Heading1"/>
       </w:pPr>
       <w:r>
-        <w:rPr>
-          <w:color w:val="F97316"/>
-        </w:rPr>
         <w:t>Step 7: GTM Push — Showcase &amp; Sales Activation</w:t>
       </w:r>
     </w:p>
@@ -2571,10 +3065,10 @@
         <w:rPr>
           <w:rFonts w:ascii="Calibri" w:hAnsi="Calibri"/>
           <w:b/>
-          <w:color w:val="F97316"/>
+          <w:color w:val="6B7280"/>
           <w:sz w:val="18"/>
         </w:rPr>
-        <w:t>●  GO-TO-MARKET</w:t>
+        <w:t>GO-TO-MARKET</w:t>
       </w:r>
     </w:p>
     <w:p>
@@ -2583,10 +3077,10 @@
       </w:pPr>
       <w:r>
         <w:rPr>
-          <w:color w:val="F97316"/>
-          <w:sz w:val="12"/>
+          <w:color w:val="D1D5DB"/>
+          <w:sz w:val="10"/>
         </w:rPr>
-        <w:t>─────────────────────────────────────────────────────────────────</w:t>
+        <w:t>────────────────────────────────────────────────────────────────────────</w:t>
       </w:r>
     </w:p>
     <w:tbl>
@@ -2597,14 +3091,35 @@
         <w:tblLook w:firstColumn="1" w:firstRow="1" w:lastColumn="0" w:lastRow="0" w:noHBand="0" w:noVBand="1" w:val="04A0"/>
       </w:tblPr>
       <w:tblGrid>
-        <w:gridCol w:w="4873"/>
-        <w:gridCol w:w="4873"/>
+        <w:gridCol w:w="3135"/>
+        <w:gridCol w:w="3135"/>
+        <w:gridCol w:w="3135"/>
       </w:tblGrid>
       <w:tr>
         <w:tc>
           <w:tcPr>
-            <w:tcW w:type="dxa" w:w="6803"/>
-            <w:shd w:fill="F97316"/>
+            <w:tcW w:type="dxa" w:w="567"/>
+            <w:shd w:fill="2B477A"/>
+          </w:tcPr>
+          <w:p>
+            <w:pPr>
+              <w:jc w:val="center"/>
+            </w:pPr>
+            <w:r>
+              <w:rPr>
+                <w:rFonts w:ascii="Calibri" w:hAnsi="Calibri"/>
+                <w:b/>
+                <w:color w:val="FFFFFF"/>
+                <w:sz w:val="18"/>
+              </w:rPr>
+              <w:t>#</w:t>
+            </w:r>
+          </w:p>
+        </w:tc>
+        <w:tc>
+          <w:tcPr>
+            <w:tcW w:type="dxa" w:w="5669"/>
+            <w:shd w:fill="2B477A"/>
           </w:tcPr>
           <w:p>
             <w:pPr>
@@ -2623,12 +3138,12 @@
         </w:tc>
         <w:tc>
           <w:tcPr>
-            <w:tcW w:type="dxa" w:w="2551"/>
-            <w:shd w:fill="F97316"/>
+            <w:tcW w:type="dxa" w:w="2835"/>
+            <w:shd w:fill="2B477A"/>
           </w:tcPr>
           <w:p>
             <w:pPr>
-              <w:jc w:val="right"/>
+              <w:jc w:val="left"/>
             </w:pPr>
             <w:r>
               <w:rPr>
@@ -2645,8 +3160,27 @@
       <w:tr>
         <w:tc>
           <w:tcPr>
-            <w:tcW w:type="dxa" w:w="6803"/>
-            <w:shd w:fill="FFEDD5"/>
+            <w:tcW w:type="dxa" w:w="567"/>
+            <w:shd w:fill="F3F4F6"/>
+          </w:tcPr>
+          <w:p>
+            <w:pPr>
+              <w:jc w:val="center"/>
+            </w:pPr>
+            <w:r>
+              <w:rPr>
+                <w:rFonts w:ascii="Calibri" w:hAnsi="Calibri"/>
+                <w:color w:val="6B7280"/>
+                <w:sz w:val="18"/>
+              </w:rPr>
+              <w:t>7.1</w:t>
+            </w:r>
+          </w:p>
+        </w:tc>
+        <w:tc>
+          <w:tcPr>
+            <w:tcW w:type="dxa" w:w="5669"/>
+            <w:shd w:fill="F3F4F6"/>
           </w:tcPr>
           <w:p>
             <w:r>
@@ -2674,18 +3208,15 @@
         </w:tc>
         <w:tc>
           <w:tcPr>
-            <w:tcW w:type="dxa" w:w="2551"/>
-            <w:shd w:fill="FFEDD5"/>
+            <w:tcW w:type="dxa" w:w="2835"/>
+            <w:shd w:fill="F3F4F6"/>
           </w:tcPr>
           <w:p>
-            <w:pPr>
-              <w:jc w:val="right"/>
-            </w:pPr>
             <w:r>
               <w:rPr>
                 <w:rFonts w:ascii="Calibri" w:hAnsi="Calibri"/>
                 <w:b/>
-                <w:color w:val="F97316"/>
+                <w:color w:val="2B477A"/>
                 <w:sz w:val="18"/>
               </w:rPr>
               <w:t>All AI Power Team</w:t>
@@ -2696,7 +3227,25 @@
       <w:tr>
         <w:tc>
           <w:tcPr>
-            <w:tcW w:type="dxa" w:w="6803"/>
+            <w:tcW w:type="dxa" w:w="567"/>
+          </w:tcPr>
+          <w:p>
+            <w:pPr>
+              <w:jc w:val="center"/>
+            </w:pPr>
+            <w:r>
+              <w:rPr>
+                <w:rFonts w:ascii="Calibri" w:hAnsi="Calibri"/>
+                <w:color w:val="6B7280"/>
+                <w:sz w:val="18"/>
+              </w:rPr>
+              <w:t>7.2</w:t>
+            </w:r>
+          </w:p>
+        </w:tc>
+        <w:tc>
+          <w:tcPr>
+            <w:tcW w:type="dxa" w:w="5669"/>
           </w:tcPr>
           <w:p>
             <w:r>
@@ -2725,17 +3274,14 @@
         </w:tc>
         <w:tc>
           <w:tcPr>
-            <w:tcW w:type="dxa" w:w="2551"/>
+            <w:tcW w:type="dxa" w:w="2835"/>
           </w:tcPr>
           <w:p>
-            <w:pPr>
-              <w:jc w:val="right"/>
-            </w:pPr>
             <w:r>
               <w:rPr>
                 <w:rFonts w:ascii="Calibri" w:hAnsi="Calibri"/>
                 <w:b/>
-                <w:color w:val="F97316"/>
+                <w:color w:val="2B477A"/>
                 <w:sz w:val="18"/>
               </w:rPr>
               <w:t>Sales + Account Partner</w:t>
@@ -2746,8 +3292,27 @@
       <w:tr>
         <w:tc>
           <w:tcPr>
-            <w:tcW w:type="dxa" w:w="6803"/>
-            <w:shd w:fill="FFEDD5"/>
+            <w:tcW w:type="dxa" w:w="567"/>
+            <w:shd w:fill="F3F4F6"/>
+          </w:tcPr>
+          <w:p>
+            <w:pPr>
+              <w:jc w:val="center"/>
+            </w:pPr>
+            <w:r>
+              <w:rPr>
+                <w:rFonts w:ascii="Calibri" w:hAnsi="Calibri"/>
+                <w:color w:val="6B7280"/>
+                <w:sz w:val="18"/>
+              </w:rPr>
+              <w:t>7.3</w:t>
+            </w:r>
+          </w:p>
+        </w:tc>
+        <w:tc>
+          <w:tcPr>
+            <w:tcW w:type="dxa" w:w="5669"/>
+            <w:shd w:fill="F3F4F6"/>
           </w:tcPr>
           <w:p>
             <w:r>
@@ -2776,18 +3341,15 @@
         </w:tc>
         <w:tc>
           <w:tcPr>
-            <w:tcW w:type="dxa" w:w="2551"/>
-            <w:shd w:fill="FFEDD5"/>
+            <w:tcW w:type="dxa" w:w="2835"/>
+            <w:shd w:fill="F3F4F6"/>
           </w:tcPr>
           <w:p>
-            <w:pPr>
-              <w:jc w:val="right"/>
-            </w:pPr>
             <w:r>
               <w:rPr>
                 <w:rFonts w:ascii="Calibri" w:hAnsi="Calibri"/>
                 <w:b/>
-                <w:color w:val="F97316"/>
+                <w:color w:val="2B477A"/>
                 <w:sz w:val="18"/>
               </w:rPr>
               <w:t>AI Champion</w:t>
@@ -2798,7 +3360,25 @@
       <w:tr>
         <w:tc>
           <w:tcPr>
-            <w:tcW w:type="dxa" w:w="6803"/>
+            <w:tcW w:type="dxa" w:w="567"/>
+          </w:tcPr>
+          <w:p>
+            <w:pPr>
+              <w:jc w:val="center"/>
+            </w:pPr>
+            <w:r>
+              <w:rPr>
+                <w:rFonts w:ascii="Calibri" w:hAnsi="Calibri"/>
+                <w:color w:val="6B7280"/>
+                <w:sz w:val="18"/>
+              </w:rPr>
+              <w:t>7.4</w:t>
+            </w:r>
+          </w:p>
+        </w:tc>
+        <w:tc>
+          <w:tcPr>
+            <w:tcW w:type="dxa" w:w="5669"/>
           </w:tcPr>
           <w:p>
             <w:r>
@@ -2826,17 +3406,14 @@
         </w:tc>
         <w:tc>
           <w:tcPr>
-            <w:tcW w:type="dxa" w:w="2551"/>
+            <w:tcW w:type="dxa" w:w="2835"/>
           </w:tcPr>
           <w:p>
-            <w:pPr>
-              <w:jc w:val="right"/>
-            </w:pPr>
             <w:r>
               <w:rPr>
                 <w:rFonts w:ascii="Calibri" w:hAnsi="Calibri"/>
                 <w:b/>
-                <w:color w:val="F97316"/>
+                <w:color w:val="2B477A"/>
                 <w:sz w:val="18"/>
               </w:rPr>
               <w:t>AI Enablement Team</w:t>
@@ -2847,8 +3424,27 @@
       <w:tr>
         <w:tc>
           <w:tcPr>
-            <w:tcW w:type="dxa" w:w="6803"/>
-            <w:shd w:fill="FFEDD5"/>
+            <w:tcW w:type="dxa" w:w="567"/>
+            <w:shd w:fill="F3F4F6"/>
+          </w:tcPr>
+          <w:p>
+            <w:pPr>
+              <w:jc w:val="center"/>
+            </w:pPr>
+            <w:r>
+              <w:rPr>
+                <w:rFonts w:ascii="Calibri" w:hAnsi="Calibri"/>
+                <w:color w:val="6B7280"/>
+                <w:sz w:val="18"/>
+              </w:rPr>
+              <w:t>7.5</w:t>
+            </w:r>
+          </w:p>
+        </w:tc>
+        <w:tc>
+          <w:tcPr>
+            <w:tcW w:type="dxa" w:w="5669"/>
+            <w:shd w:fill="F3F4F6"/>
           </w:tcPr>
           <w:p>
             <w:r>
@@ -2876,18 +3472,15 @@
         </w:tc>
         <w:tc>
           <w:tcPr>
-            <w:tcW w:type="dxa" w:w="2551"/>
-            <w:shd w:fill="FFEDD5"/>
+            <w:tcW w:type="dxa" w:w="2835"/>
+            <w:shd w:fill="F3F4F6"/>
           </w:tcPr>
           <w:p>
-            <w:pPr>
-              <w:jc w:val="right"/>
-            </w:pPr>
             <w:r>
               <w:rPr>
                 <w:rFonts w:ascii="Calibri" w:hAnsi="Calibri"/>
                 <w:b/>
-                <w:color w:val="F97316"/>
+                <w:color w:val="2B477A"/>
                 <w:sz w:val="18"/>
               </w:rPr>
               <w:t>AI Enablement Team</w:t>
@@ -2907,9 +3500,6 @@
         <w:pStyle w:val="Heading1"/>
       </w:pPr>
       <w:r>
-        <w:rPr>
-          <w:color w:val="14B8A6"/>
-        </w:rPr>
         <w:t>Step 8: Track Results &amp; Continuous Improvement</w:t>
       </w:r>
     </w:p>
@@ -2918,10 +3508,10 @@
         <w:rPr>
           <w:rFonts w:ascii="Calibri" w:hAnsi="Calibri"/>
           <w:b/>
-          <w:color w:val="14B8A6"/>
+          <w:color w:val="6B7280"/>
           <w:sz w:val="18"/>
         </w:rPr>
-        <w:t>●  MEASURE</w:t>
+        <w:t>MEASURE</w:t>
       </w:r>
     </w:p>
     <w:p>
@@ -2930,10 +3520,10 @@
       </w:pPr>
       <w:r>
         <w:rPr>
-          <w:color w:val="14B8A6"/>
-          <w:sz w:val="12"/>
+          <w:color w:val="D1D5DB"/>
+          <w:sz w:val="10"/>
         </w:rPr>
-        <w:t>─────────────────────────────────────────────────────────────────</w:t>
+        <w:t>────────────────────────────────────────────────────────────────────────</w:t>
       </w:r>
     </w:p>
     <w:tbl>
@@ -2944,14 +3534,35 @@
         <w:tblLook w:firstColumn="1" w:firstRow="1" w:lastColumn="0" w:lastRow="0" w:noHBand="0" w:noVBand="1" w:val="04A0"/>
       </w:tblPr>
       <w:tblGrid>
-        <w:gridCol w:w="4873"/>
-        <w:gridCol w:w="4873"/>
+        <w:gridCol w:w="3135"/>
+        <w:gridCol w:w="3135"/>
+        <w:gridCol w:w="3135"/>
       </w:tblGrid>
       <w:tr>
         <w:tc>
           <w:tcPr>
-            <w:tcW w:type="dxa" w:w="6803"/>
-            <w:shd w:fill="14B8A6"/>
+            <w:tcW w:type="dxa" w:w="567"/>
+            <w:shd w:fill="2B477A"/>
+          </w:tcPr>
+          <w:p>
+            <w:pPr>
+              <w:jc w:val="center"/>
+            </w:pPr>
+            <w:r>
+              <w:rPr>
+                <w:rFonts w:ascii="Calibri" w:hAnsi="Calibri"/>
+                <w:b/>
+                <w:color w:val="FFFFFF"/>
+                <w:sz w:val="18"/>
+              </w:rPr>
+              <w:t>#</w:t>
+            </w:r>
+          </w:p>
+        </w:tc>
+        <w:tc>
+          <w:tcPr>
+            <w:tcW w:type="dxa" w:w="5669"/>
+            <w:shd w:fill="2B477A"/>
           </w:tcPr>
           <w:p>
             <w:pPr>
@@ -2970,12 +3581,12 @@
         </w:tc>
         <w:tc>
           <w:tcPr>
-            <w:tcW w:type="dxa" w:w="2551"/>
-            <w:shd w:fill="14B8A6"/>
+            <w:tcW w:type="dxa" w:w="2835"/>
+            <w:shd w:fill="2B477A"/>
           </w:tcPr>
           <w:p>
             <w:pPr>
-              <w:jc w:val="right"/>
+              <w:jc w:val="left"/>
             </w:pPr>
             <w:r>
               <w:rPr>
@@ -2992,8 +3603,27 @@
       <w:tr>
         <w:tc>
           <w:tcPr>
-            <w:tcW w:type="dxa" w:w="6803"/>
-            <w:shd w:fill="CCFBF1"/>
+            <w:tcW w:type="dxa" w:w="567"/>
+            <w:shd w:fill="F3F4F6"/>
+          </w:tcPr>
+          <w:p>
+            <w:pPr>
+              <w:jc w:val="center"/>
+            </w:pPr>
+            <w:r>
+              <w:rPr>
+                <w:rFonts w:ascii="Calibri" w:hAnsi="Calibri"/>
+                <w:color w:val="6B7280"/>
+                <w:sz w:val="18"/>
+              </w:rPr>
+              <w:t>8.1</w:t>
+            </w:r>
+          </w:p>
+        </w:tc>
+        <w:tc>
+          <w:tcPr>
+            <w:tcW w:type="dxa" w:w="5669"/>
+            <w:shd w:fill="F3F4F6"/>
           </w:tcPr>
           <w:p>
             <w:r>
@@ -3022,18 +3652,15 @@
         </w:tc>
         <w:tc>
           <w:tcPr>
-            <w:tcW w:type="dxa" w:w="2551"/>
-            <w:shd w:fill="CCFBF1"/>
+            <w:tcW w:type="dxa" w:w="2835"/>
+            <w:shd w:fill="F3F4F6"/>
           </w:tcPr>
           <w:p>
-            <w:pPr>
-              <w:jc w:val="right"/>
-            </w:pPr>
             <w:r>
               <w:rPr>
                 <w:rFonts w:ascii="Calibri" w:hAnsi="Calibri"/>
                 <w:b/>
-                <w:color w:val="14B8A6"/>
+                <w:color w:val="2B477A"/>
                 <w:sz w:val="18"/>
               </w:rPr>
               <w:t>AI Enablement + AI Champion + Sponsor</w:t>
@@ -3044,7 +3671,25 @@
       <w:tr>
         <w:tc>
           <w:tcPr>
-            <w:tcW w:type="dxa" w:w="6803"/>
+            <w:tcW w:type="dxa" w:w="567"/>
+          </w:tcPr>
+          <w:p>
+            <w:pPr>
+              <w:jc w:val="center"/>
+            </w:pPr>
+            <w:r>
+              <w:rPr>
+                <w:rFonts w:ascii="Calibri" w:hAnsi="Calibri"/>
+                <w:color w:val="6B7280"/>
+                <w:sz w:val="18"/>
+              </w:rPr>
+              <w:t>8.2</w:t>
+            </w:r>
+          </w:p>
+        </w:tc>
+        <w:tc>
+          <w:tcPr>
+            <w:tcW w:type="dxa" w:w="5669"/>
           </w:tcPr>
           <w:p>
             <w:r>
@@ -3073,17 +3718,14 @@
         </w:tc>
         <w:tc>
           <w:tcPr>
-            <w:tcW w:type="dxa" w:w="2551"/>
+            <w:tcW w:type="dxa" w:w="2835"/>
           </w:tcPr>
           <w:p>
-            <w:pPr>
-              <w:jc w:val="right"/>
-            </w:pPr>
             <w:r>
               <w:rPr>
                 <w:rFonts w:ascii="Calibri" w:hAnsi="Calibri"/>
                 <w:b/>
-                <w:color w:val="14B8A6"/>
+                <w:color w:val="2B477A"/>
                 <w:sz w:val="18"/>
               </w:rPr>
               <w:t>AI Enablement + Business Sponsor</w:t>
@@ -3094,8 +3736,27 @@
       <w:tr>
         <w:tc>
           <w:tcPr>
-            <w:tcW w:type="dxa" w:w="6803"/>
-            <w:shd w:fill="CCFBF1"/>
+            <w:tcW w:type="dxa" w:w="567"/>
+            <w:shd w:fill="F3F4F6"/>
+          </w:tcPr>
+          <w:p>
+            <w:pPr>
+              <w:jc w:val="center"/>
+            </w:pPr>
+            <w:r>
+              <w:rPr>
+                <w:rFonts w:ascii="Calibri" w:hAnsi="Calibri"/>
+                <w:color w:val="6B7280"/>
+                <w:sz w:val="18"/>
+              </w:rPr>
+              <w:t>8.3</w:t>
+            </w:r>
+          </w:p>
+        </w:tc>
+        <w:tc>
+          <w:tcPr>
+            <w:tcW w:type="dxa" w:w="5669"/>
+            <w:shd w:fill="F3F4F6"/>
           </w:tcPr>
           <w:p>
             <w:r>
@@ -3123,18 +3784,15 @@
         </w:tc>
         <w:tc>
           <w:tcPr>
-            <w:tcW w:type="dxa" w:w="2551"/>
-            <w:shd w:fill="CCFBF1"/>
+            <w:tcW w:type="dxa" w:w="2835"/>
+            <w:shd w:fill="F3F4F6"/>
           </w:tcPr>
           <w:p>
-            <w:pPr>
-              <w:jc w:val="right"/>
-            </w:pPr>
             <w:r>
               <w:rPr>
                 <w:rFonts w:ascii="Calibri" w:hAnsi="Calibri"/>
                 <w:b/>
-                <w:color w:val="14B8A6"/>
+                <w:color w:val="2B477A"/>
                 <w:sz w:val="18"/>
               </w:rPr>
               <w:t>AI Enablement Team</w:t>
@@ -3145,7 +3803,25 @@
       <w:tr>
         <w:tc>
           <w:tcPr>
-            <w:tcW w:type="dxa" w:w="6803"/>
+            <w:tcW w:type="dxa" w:w="567"/>
+          </w:tcPr>
+          <w:p>
+            <w:pPr>
+              <w:jc w:val="center"/>
+            </w:pPr>
+            <w:r>
+              <w:rPr>
+                <w:rFonts w:ascii="Calibri" w:hAnsi="Calibri"/>
+                <w:color w:val="6B7280"/>
+                <w:sz w:val="18"/>
+              </w:rPr>
+              <w:t>8.4</w:t>
+            </w:r>
+          </w:p>
+        </w:tc>
+        <w:tc>
+          <w:tcPr>
+            <w:tcW w:type="dxa" w:w="5669"/>
           </w:tcPr>
           <w:p>
             <w:r>
@@ -3174,17 +3850,14 @@
         </w:tc>
         <w:tc>
           <w:tcPr>
-            <w:tcW w:type="dxa" w:w="2551"/>
+            <w:tcW w:type="dxa" w:w="2835"/>
           </w:tcPr>
           <w:p>
-            <w:pPr>
-              <w:jc w:val="right"/>
-            </w:pPr>
             <w:r>
               <w:rPr>
                 <w:rFonts w:ascii="Calibri" w:hAnsi="Calibri"/>
                 <w:b/>
-                <w:color w:val="14B8A6"/>
+                <w:color w:val="2B477A"/>
                 <w:sz w:val="18"/>
               </w:rPr>
               <w:t>AI Champion + Domain Leader</w:t>
@@ -3201,13 +3874,13 @@
         <w:tblLook w:firstColumn="1" w:firstRow="1" w:lastColumn="0" w:lastRow="0" w:noHBand="0" w:noVBand="1" w:val="04A0"/>
       </w:tblPr>
       <w:tblGrid>
-        <w:gridCol w:w="9746"/>
+        <w:gridCol w:w="9406"/>
       </w:tblGrid>
       <w:tr>
         <w:tc>
           <w:tcPr>
-            <w:tcW w:type="dxa" w:w="9746"/>
-            <w:shd w:fill="CCFBF1"/>
+            <w:tcW w:type="dxa" w:w="9406"/>
+            <w:shd w:fill="F3F4F6"/>
           </w:tcPr>
           <w:p>
             <w:pPr>
@@ -3216,15 +3889,15 @@
             <w:r>
               <w:rPr>
                 <w:b/>
-                <w:color w:val="14B8A6"/>
-                <w:sz w:val="21"/>
+                <w:color w:val="2B477A"/>
+                <w:sz w:val="20"/>
               </w:rPr>
-              <w:t xml:space="preserve">↻  Continuous Loop: </w:t>
+              <w:t xml:space="preserve">Continuous Loop: </w:t>
             </w:r>
             <w:r>
               <w:rPr>
-                <w:color w:val="333333"/>
-                <w:sz w:val="20"/>
+                <w:color w:val="374151"/>
+                <w:sz w:val="19"/>
               </w:rPr>
               <w:t>Results feed back into Step 1. Client feedback generates new ideas, successful demos inspire adjacent solutions, market learnings sharpen future intake.</w:t>
             </w:r>
@@ -3234,7 +3907,7 @@
     </w:tbl>
     <w:sectPr>
       <w:pgSz w:w="12240" w:h="15840"/>
-      <w:pgMar w:top="1134" w:right="1247" w:bottom="1134" w:left="1247" w:header="720" w:footer="720" w:gutter="0"/>
+      <w:pgMar w:top="1247" w:right="1417" w:bottom="1247" w:left="1417" w:header="720" w:footer="720" w:gutter="0"/>
       <w:cols w:space="720"/>
       <w:docGrid w:linePitch="360"/>
     </w:sectPr>
@@ -3610,7 +4283,7 @@
     </w:pPr>
     <w:rPr>
       <w:rFonts w:ascii="Calibri" w:hAnsi="Calibri"/>
-      <w:color w:val="333333"/>
+      <w:color w:val="1A1A2E"/>
       <w:sz w:val="21"/>
     </w:rPr>
   </w:style>
@@ -3669,15 +4342,15 @@
     <w:pPr>
       <w:keepNext/>
       <w:keepLines/>
-      <w:spacing w:before="0" w:after="120"/>
+      <w:spacing w:before="0" w:after="80"/>
       <w:outlineLvl w:val="0"/>
     </w:pPr>
     <w:rPr>
       <w:rFonts w:asciiTheme="majorHAnsi" w:eastAsiaTheme="majorEastAsia" w:hAnsiTheme="majorHAnsi" w:cstheme="majorBidi" w:ascii="Calibri" w:hAnsi="Calibri"/>
       <w:b/>
       <w:bCs/>
-      <w:color w:val="365F91" w:themeColor="accent1" w:themeShade="BF"/>
-      <w:sz w:val="44"/>
+      <w:color w:val="1A1A2E"/>
+      <w:sz w:val="40"/>
       <w:szCs w:val="28"/>
     </w:rPr>
   </w:style>
@@ -3693,15 +4366,15 @@
     <w:pPr>
       <w:keepNext/>
       <w:keepLines/>
-      <w:spacing w:before="240" w:after="80"/>
+      <w:spacing w:before="200" w:after="80"/>
       <w:outlineLvl w:val="1"/>
     </w:pPr>
     <w:rPr>
       <w:rFonts w:asciiTheme="majorHAnsi" w:eastAsiaTheme="majorEastAsia" w:hAnsiTheme="majorHAnsi" w:cstheme="majorBidi" w:ascii="Calibri" w:hAnsi="Calibri"/>
       <w:b/>
       <w:bCs/>
-      <w:color w:val="4F81BD" w:themeColor="accent1"/>
-      <w:sz w:val="28"/>
+      <w:color w:val="2B477A"/>
+      <w:sz w:val="26"/>
       <w:szCs w:val="26"/>
     </w:rPr>
   </w:style>
@@ -3717,15 +4390,14 @@
     <w:pPr>
       <w:keepNext/>
       <w:keepLines/>
-      <w:spacing w:before="160" w:after="60"/>
+      <w:spacing w:before="200" w:after="0"/>
       <w:outlineLvl w:val="2"/>
     </w:pPr>
     <w:rPr>
-      <w:rFonts w:asciiTheme="majorHAnsi" w:eastAsiaTheme="majorEastAsia" w:hAnsiTheme="majorHAnsi" w:cstheme="majorBidi" w:ascii="Calibri" w:hAnsi="Calibri"/>
+      <w:rFonts w:asciiTheme="majorHAnsi" w:eastAsiaTheme="majorEastAsia" w:hAnsiTheme="majorHAnsi" w:cstheme="majorBidi"/>
       <w:b/>
       <w:bCs/>
       <w:color w:val="4F81BD" w:themeColor="accent1"/>
-      <w:sz w:val="22"/>
     </w:rPr>
   </w:style>
   <w:style w:type="paragraph" w:styleId="Heading4">

</xml_diff>

<commit_message>
Clarify Jira setup role and add Governance Call to build phase
- Step 4: AI Enablement Team sets up Jira project and folder structure
  (epics, stories, and backlog are defined later during the build phase)
- Step 5: Added Governance Call task — AI Forward Engineer presents the
  solution, walks through architecture, and completes risk assessment
  before launch proceeds to GTM

Applied across HTML, DOCX, and PPTX.

https://claude.ai/code/session_014sYowDSYncDohFg42MDKfr
</commit_message>
<xml_diff>
--- a/AI-Use-Case-to-GTM-Step-Guide.docx
+++ b/AI-Use-Case-to-GTM-Step-Guide.docx
@@ -1933,14 +1933,14 @@
                 <w:b/>
                 <w:sz w:val="20"/>
               </w:rPr>
-              <w:t>Set Up Jira</w:t>
+              <w:t>Set Up Jira &amp; Project Folder</w:t>
             </w:r>
             <w:r>
               <w:rPr>
                 <w:rFonts w:ascii="Calibri" w:hAnsi="Calibri"/>
                 <w:sz w:val="20"/>
               </w:rPr>
-              <w:t xml:space="preserve"> — Create project, epics, stories &amp; sprint backlog</w:t>
+              <w:t xml:space="preserve"> — Create Jira project and project folder structure (epics, stories &amp; backlog defined during build)</w:t>
             </w:r>
           </w:p>
         </w:tc>
@@ -2532,6 +2532,71 @@
                 <w:sz w:val="18"/>
               </w:rPr>
               <w:t>AI Enablement Team</w:t>
+            </w:r>
+          </w:p>
+        </w:tc>
+      </w:tr>
+      <w:tr>
+        <w:tc>
+          <w:tcPr>
+            <w:tcW w:type="dxa" w:w="567"/>
+          </w:tcPr>
+          <w:p>
+            <w:pPr>
+              <w:jc w:val="center"/>
+            </w:pPr>
+            <w:r>
+              <w:rPr>
+                <w:rFonts w:ascii="Calibri" w:hAnsi="Calibri"/>
+                <w:color w:val="6B7280"/>
+                <w:sz w:val="18"/>
+              </w:rPr>
+              <w:t>5.6</w:t>
+            </w:r>
+          </w:p>
+        </w:tc>
+        <w:tc>
+          <w:tcPr>
+            <w:tcW w:type="dxa" w:w="5669"/>
+          </w:tcPr>
+          <w:p>
+            <w:r>
+              <w:rPr>
+                <w:rFonts w:ascii="Calibri" w:hAnsi="Calibri"/>
+                <w:sz w:val="20"/>
+              </w:rPr>
+              <w:t xml:space="preserve">Present solution on </w:t>
+            </w:r>
+            <w:r>
+              <w:rPr>
+                <w:rFonts w:ascii="Calibri" w:hAnsi="Calibri"/>
+                <w:b/>
+                <w:sz w:val="20"/>
+              </w:rPr>
+              <w:t>Governance Call</w:t>
+            </w:r>
+            <w:r>
+              <w:rPr>
+                <w:rFonts w:ascii="Calibri" w:hAnsi="Calibri"/>
+                <w:sz w:val="20"/>
+              </w:rPr>
+              <w:t xml:space="preserve"> — explain the solution, walk through architecture &amp; complete risk assessment before launch</w:t>
+            </w:r>
+          </w:p>
+        </w:tc>
+        <w:tc>
+          <w:tcPr>
+            <w:tcW w:type="dxa" w:w="2835"/>
+          </w:tcPr>
+          <w:p>
+            <w:r>
+              <w:rPr>
+                <w:rFonts w:ascii="Calibri" w:hAnsi="Calibri"/>
+                <w:b/>
+                <w:color w:val="2B477A"/>
+                <w:sz w:val="18"/>
+              </w:rPr>
+              <w:t>AI Forward Engineer</w:t>
             </w:r>
           </w:p>
         </w:tc>

</xml_diff>

<commit_message>
Refine task wording and role assignments across all formats
- Step 3: "Determine scope POC/MVP/Full Build" → "Evaluate use case
  based on business value & tech depth"
- Step 4: Remove "via Retain" from resource allocation
- Step 5: Add AI Champion to sprint cycles task (alongside AI Fwd
  Engineer and AI Enablement Team)
- Step 8: Add AI Enablement Team to client feedback capture task
  (alongside AI Champion and Domain Leader)

https://claude.ai/code/session_014sYowDSYncDohFg42MDKfr
</commit_message>
<xml_diff>
--- a/AI-Use-Case-to-GTM-Step-Guide.docx
+++ b/AI-Use-Case-to-GTM-Step-Guide.docx
@@ -1438,7 +1438,6 @@
                 <w:rFonts w:ascii="Calibri" w:hAnsi="Calibri"/>
                 <w:sz w:val="20"/>
               </w:rPr>
-              <w:t xml:space="preserve">Determine scope: </w:t>
             </w:r>
             <w:r>
               <w:rPr>
@@ -1446,7 +1445,7 @@
                 <w:b/>
                 <w:sz w:val="20"/>
               </w:rPr>
-              <w:t>POC / MVP / Full Build</w:t>
+              <w:t>Evaluate use case</w:t>
             </w:r>
             <w:r>
               <w:rPr>
@@ -2006,7 +2005,7 @@
                 <w:rFonts w:ascii="Calibri" w:hAnsi="Calibri"/>
                 <w:sz w:val="20"/>
               </w:rPr>
-              <w:t xml:space="preserve"> — Assign AI Forward Engineers via Retain</w:t>
+              <w:t xml:space="preserve"> — Assign AI Forward Engineers</w:t>
             </w:r>
           </w:p>
         </w:tc>
@@ -2331,7 +2330,7 @@
                 <w:color w:val="2B477A"/>
                 <w:sz w:val="18"/>
               </w:rPr>
-              <w:t>AI Fwd Engineer + AI Enablement Team</w:t>
+              <w:t>AI Fwd Engineer + AI Enablement Team + AI Champion</w:t>
             </w:r>
           </w:p>
         </w:tc>
@@ -3925,7 +3924,7 @@
                 <w:color w:val="2B477A"/>
                 <w:sz w:val="18"/>
               </w:rPr>
-              <w:t>AI Champion + Domain Leader</w:t>
+              <w:t>AI Champion + Domain Leader + AI Enablement Team</w:t>
             </w:r>
           </w:p>
         </w:tc>

</xml_diff>